<commit_message>
Prepare public research documentation and project identity
</commit_message>
<xml_diff>
--- a/paper/dist/ncm-mlx.docx
+++ b/paper/dist/ncm-mlx.docx
@@ -15,13 +15,24 @@
     </w:p>
     <w:p>
       <w:pPr>
+        <w:pStyle w:val="Author"/>
+      </w:pPr>
+      <w:r>
+        <w:rPr>
+          <w:lang w:val="en-GB"/>
+        </w:rPr>
+        <w:t xml:space="preserve">Jan Music</w:t>
+      </w:r>
+    </w:p>
+    <w:p>
+      <w:pPr>
         <w:pStyle w:val="Date"/>
       </w:pPr>
       <w:r>
         <w:rPr>
           <w:lang w:val="en-GB"/>
         </w:rPr>
-        <w:t xml:space="preserve">v0.7 · 2026-10-24</w:t>
+        <w:t xml:space="preserve">v0.8 · 2026-10-24</w:t>
       </w:r>
     </w:p>
     <w:p>
@@ -40,7 +51,7 @@
         <w:rPr>
           <w:lang w:val="en-GB"/>
         </w:rPr>
-        <w:t xml:space="preserve">Next-concept modeling (NCM) writes a sequence the way a painter works: a rough sketch first, then finer and finer detail, with every piece of a level produced at once. We reimplement NCM from its paper and released configurations in MLX, Apple’s array framework, and study it on an Apple M5 Pro laptop and single NVIDIA GPUs. On a synthetic 15,360-sentence language, a 5M-parameter NCM model is 4–5× faster than an equal-size word-by-word (autoregressive) model at small batch sizes but less accurate (89.8% vs 98.6% valid sentences). On the paper’s Sudoku benchmark our autoregressive baseline reproduces the published autoregressive result (13.8% vs 14.6% of easy boards solved), while our NCM, with conditioning corruption and unique-solution puzzles, solves 96.2% of easy, 76.6% of medium and 31.9% of hard boards when trained on 8M sequences (99.5%, 96.5% and 86.1% reported for the original’s 4× larger model trained on 51M), far more than the equal-size autoregressive model. We trace the path step by step: the level schedule, a learned first level, conditioning corruption and its strength, and above all training data. We also report that fp32 matrix products on Apple GPUs run at reduced precision and that computing block-diagonal attention per level speeds training by 1.35×.</w:t>
+        <w:t xml:space="preserve">Next-concept modeling (NCM) writes a sequence the way a painter works: a rough sketch first, then finer and finer detail, with every piece of a level produced at once. We independently implement NCM from its paper and released configurations in MLX, Apple’s array framework, and study it on an Apple M5 Pro laptop and single NVIDIA GPUs. On a synthetic 15,360-sentence language, a 5M-parameter NCM generator is faster than a character-level autoregressive (AR) model of similar generator size at small batches but less accurate (89.8% vs 98.6% valid sentences). On the published Sudoku boards, NCM with conditioning corruption and unique-solution puzzles solves 96.25% of easy, 76.65% of medium and 31.90% of hard boards after 8.192M generator presentations. The original reports 99.5%, 96.5% and 86.1% with a roughly 4× larger generator and 51.2M presentations; this is an unmatched comparison. A separate 2.048M-presentation comparison favors NCM over the AR baseline, but excludes NCM’s additional codec training cost. We trace the effects of the level schedule, learned first level, conditioning corruption and training exposure. We also measure reduced precision in fp32 matrix products on Apple GPUs and a 1.35× training improvement from segmented block-diagonal attention.</w:t>
       </w:r>
     </w:p>
     <w:p>
@@ -65,7 +76,7 @@
         <w:rPr>
           <w:lang w:val="en-GB"/>
         </w:rPr>
-        <w:t xml:space="preserve">Working paper, version 0.7. Every number here is copied from a run in the code repository (</w:t>
+        <w:t xml:space="preserve">Working paper, version 0.8. Every number here is copied from a run in the code repository (</w:t>
       </w:r>
       <w:r>
         <w:rPr>
@@ -520,7 +531,7 @@
         <w:rPr>
           <w:lang w:val="en-GB"/>
         </w:rPr>
-        <w:t xml:space="preserve">The number of rounds is fixed (six here, twelve in the original paper’s Sudoku model) and does not grow with the length of the text, so NCM needs far fewer model runs than a word-by-word model. That is where its speed comes from.</w:t>
+        <w:t xml:space="preserve">The number of rounds is fixed by the model configuration (six in TinyWorld, twelve in the original paper’s Sudoku model), so NCM needs far fewer model runs than a word-by-word model. That is where its speed comes from.</w:t>
       </w:r>
     </w:p>
     <w:p>
@@ -595,7 +606,7 @@
         <w:rPr>
           <w:lang w:val="en-GB"/>
         </w:rPr>
-        <w:t xml:space="preserve">is like an image format with progressive loading: a JPEG that first shows a blurry picture, then sharpens. It learns to turn a sentence into a stack of codes, from one coarse code to one code per letter, and to turn the codes back into the sentence. It is trained first, on its own, until it rebuilds sentences perfectly.</w:t>
+        <w:t xml:space="preserve">is like an image format with progressive loading: a JPEG that first shows a blurry picture, then sharpens. It learns to turn a sentence into a stack of codes, from one coarse code to one code per letter, and to turn the codes back into the sentence. It is trained first, on its own, with reconstruction losses. Full-hierarchy reconstruction is measured separately from generation quality.</w:t>
       </w:r>
     </w:p>
     <w:p>
@@ -763,7 +774,7 @@
         <w:rPr>
           <w:lang w:val="en-GB"/>
         </w:rPr>
-        <w:t xml:space="preserve">, tested it on a small invented language and on Sudoku puzzles (the original paper’s showcase), and compared it with a word-by-word model of the same size and with a large chat model. The speed advantage holds on a laptop. On Sudoku our best model solves 96% of easy boards (the original: 99.5%) and beats a word-by-word model of the same size; Section 8 tells how we got there.</w:t>
+        <w:t xml:space="preserve">, tested it on a small invented language and on Sudoku puzzles (the original paper’s showcase), and compared it with a character-level AR model of similar generator size and with a large chat model. The speed advantage holds on a laptop. On Sudoku our best model solves 96% of easy boards (the original: 99.5%) and beats the smaller-budget AR reference; a separate comparison matches generator presentations; Section 8 tells how we got there.</w:t>
       </w:r>
     </w:p>
     <w:p>
@@ -2185,7 +2196,7 @@
         <w:rPr>
           <w:lang w:val="en-GB"/>
         </w:rPr>
-        <w:t xml:space="preserve">refine all positions of a sequence over</w:t>
+        <w:t xml:space="preserve">refine positions of a sequence over</w:t>
       </w:r>
       <w:r>
         <w:rPr>
@@ -2241,7 +2252,7 @@
         <w:rPr>
           <w:lang w:val="en-GB"/>
         </w:rPr>
-        <w:t xml:space="preserve">. Each step processes the full length</w:t>
+        <w:t xml:space="preserve">. Full-sequence samplers process length</w:t>
       </w:r>
       <w:r>
         <w:rPr>
@@ -2258,53 +2269,13 @@
         <w:rPr>
           <w:lang w:val="en-GB"/>
         </w:rPr>
-        <w:t xml:space="preserve">; NCM’s coarse levels are short, so its total work is closer to one pass over</w:t>
-      </w:r>
-      <w:r>
-        <w:rPr>
-          <w:lang w:val="en-GB"/>
-        </w:rPr>
-        <w:t xml:space="preserve"> </w:t>
-      </w:r>
-      <m:oMath>
-        <m:r>
-          <m:t>L</m:t>
-        </m:r>
-      </m:oMath>
-      <w:r>
-        <w:rPr>
-          <w:lang w:val="en-GB"/>
-        </w:rPr>
-        <w:t xml:space="preserve"> </w:t>
-      </w:r>
-      <w:r>
-        <w:rPr>
-          <w:lang w:val="en-GB"/>
-        </w:rPr>
-        <w:t xml:space="preserve">positions spread across</w:t>
-      </w:r>
-      <w:r>
-        <w:rPr>
-          <w:lang w:val="en-GB"/>
-        </w:rPr>
-        <w:t xml:space="preserve"> </w:t>
-      </w:r>
-      <m:oMath>
-        <m:r>
-          <m:t>K</m:t>
-        </m:r>
-      </m:oMath>
-      <w:r>
-        <w:rPr>
-          <w:lang w:val="en-GB"/>
-        </w:rPr>
-        <w:t xml:space="preserve"> </w:t>
-      </w:r>
-      <w:r>
-        <w:rPr>
-          <w:lang w:val="en-GB"/>
-        </w:rPr>
-        <w:t xml:space="preserve">steps. The NCM paper reports quality at or above strong diffusion language models with 10–31× faster generation on an H100 GPU</w:t>
+        <w:t xml:space="preserve"> </w:t>
+      </w:r>
+      <w:r>
+        <w:rPr>
+          <w:lang w:val="en-GB"/>
+        </w:rPr>
+        <w:t xml:space="preserve">at each step; NCM’s early levels process fewer code positions, although prefix and decoder work also contribute. The NCM paper reports quality at or above strong diffusion language models with 10–31× faster generation under its H100 benchmark protocol</w:t>
       </w:r>
       <w:r>
         <w:rPr>
@@ -6868,13 +6839,46 @@
         <w:rPr>
           <w:lang w:val="en-GB"/>
         </w:rPr>
-        <w:t xml:space="preserve">holds the conditioning, for Sudoku the 81 cells of the puzzle (blanks as 0). Level 0 has nothing above it, so it reads learned query vectors. Every other level reads the reconstruction from all coarser levels, shrunk to its own length. Toy example: input</w:t>
+        <w:t xml:space="preserve">holds the conditioning, for Sudoku the 81 cells of the puzzle (blanks as 0). Level 0 has nothing above it, so it reads learned query vectors. Every other level reads the reconstruction from all coarser levels, shrunk to its own length. Toy example:</w:t>
+      </w:r>
+      <w:r>
+        <w:rPr>
+          <w:lang w:val="en-GB"/>
+        </w:rPr>
+        <w:t xml:space="preserve"> </w:t>
       </w:r>
       <m:oMath>
         <m:sSub>
           <m:e>
             <m:r>
-              <m:t>​</m:t>
+              <m:rPr>
+                <m:sty m:val="p"/>
+              </m:rPr>
+              <m:t>i</m:t>
+            </m:r>
+            <m:r>
+              <m:rPr>
+                <m:sty m:val="p"/>
+              </m:rPr>
+              <m:t>n</m:t>
+            </m:r>
+            <m:r>
+              <m:rPr>
+                <m:sty m:val="p"/>
+              </m:rPr>
+              <m:t>p</m:t>
+            </m:r>
+            <m:r>
+              <m:rPr>
+                <m:sty m:val="p"/>
+              </m:rPr>
+              <m:t>u</m:t>
+            </m:r>
+            <m:r>
+              <m:rPr>
+                <m:sty m:val="p"/>
+              </m:rPr>
+              <m:t>t</m:t>
             </m:r>
           </m:e>
           <m:sub>
@@ -7734,13 +7738,46 @@
         <w:rPr>
           <w:lang w:val="en-GB"/>
         </w:rPr>
-        <w:t xml:space="preserve">only through input</w:t>
+        <w:t xml:space="preserve">only through</w:t>
+      </w:r>
+      <w:r>
+        <w:rPr>
+          <w:lang w:val="en-GB"/>
+        </w:rPr>
+        <w:t xml:space="preserve"> </w:t>
       </w:r>
       <m:oMath>
         <m:sSub>
           <m:e>
             <m:r>
-              <m:t>​</m:t>
+              <m:rPr>
+                <m:sty m:val="p"/>
+              </m:rPr>
+              <m:t>i</m:t>
+            </m:r>
+            <m:r>
+              <m:rPr>
+                <m:sty m:val="p"/>
+              </m:rPr>
+              <m:t>n</m:t>
+            </m:r>
+            <m:r>
+              <m:rPr>
+                <m:sty m:val="p"/>
+              </m:rPr>
+              <m:t>p</m:t>
+            </m:r>
+            <m:r>
+              <m:rPr>
+                <m:sty m:val="p"/>
+              </m:rPr>
+              <m:t>u</m:t>
+            </m:r>
+            <m:r>
+              <m:rPr>
+                <m:sty m:val="p"/>
+              </m:rPr>
+              <m:t>t</m:t>
             </m:r>
           </m:e>
           <m:sub>
@@ -8387,13 +8424,46 @@
         <w:rPr>
           <w:lang w:val="en-GB"/>
         </w:rPr>
-        <w:t xml:space="preserve">: run the generator on input</w:t>
+        <w:t xml:space="preserve">: run the generator on</w:t>
+      </w:r>
+      <w:r>
+        <w:rPr>
+          <w:lang w:val="en-GB"/>
+        </w:rPr>
+        <w:t xml:space="preserve"> </w:t>
       </w:r>
       <m:oMath>
         <m:sSub>
           <m:e>
             <m:r>
-              <m:t>​</m:t>
+              <m:rPr>
+                <m:sty m:val="p"/>
+              </m:rPr>
+              <m:t>i</m:t>
+            </m:r>
+            <m:r>
+              <m:rPr>
+                <m:sty m:val="p"/>
+              </m:rPr>
+              <m:t>n</m:t>
+            </m:r>
+            <m:r>
+              <m:rPr>
+                <m:sty m:val="p"/>
+              </m:rPr>
+              <m:t>p</m:t>
+            </m:r>
+            <m:r>
+              <m:rPr>
+                <m:sty m:val="p"/>
+              </m:rPr>
+              <m:t>u</m:t>
+            </m:r>
+            <m:r>
+              <m:rPr>
+                <m:sty m:val="p"/>
+              </m:rPr>
+              <m:t>t</m:t>
             </m:r>
           </m:e>
           <m:sub>
@@ -8500,13 +8570,46 @@
         <w:rPr>
           <w:lang w:val="en-GB"/>
         </w:rPr>
-        <w:t xml:space="preserve">to the reconstruction and shrink it into input</w:t>
+        <w:t xml:space="preserve">to the reconstruction and shrink it into</w:t>
+      </w:r>
+      <w:r>
+        <w:rPr>
+          <w:lang w:val="en-GB"/>
+        </w:rPr>
+        <w:t xml:space="preserve"> </w:t>
       </w:r>
       <m:oMath>
         <m:sSub>
           <m:e>
             <m:r>
-              <m:t>​</m:t>
+              <m:rPr>
+                <m:sty m:val="p"/>
+              </m:rPr>
+              <m:t>i</m:t>
+            </m:r>
+            <m:r>
+              <m:rPr>
+                <m:sty m:val="p"/>
+              </m:rPr>
+              <m:t>n</m:t>
+            </m:r>
+            <m:r>
+              <m:rPr>
+                <m:sty m:val="p"/>
+              </m:rPr>
+              <m:t>p</m:t>
+            </m:r>
+            <m:r>
+              <m:rPr>
+                <m:sty m:val="p"/>
+              </m:rPr>
+              <m:t>u</m:t>
+            </m:r>
+            <m:r>
+              <m:rPr>
+                <m:sty m:val="p"/>
+              </m:rPr>
+              <m:t>t</m:t>
             </m:r>
           </m:e>
           <m:sub>
@@ -9515,7 +9618,7 @@
         <w:rPr>
           <w:lang w:val="en-GB"/>
         </w:rPr>
-        <w:t xml:space="preserve">. This matters for anyone writing equivalence tests for MLX models; it does not affect sampling quality.</w:t>
+        <w:t xml:space="preserve">. This matters for anyone writing equivalence tests for MLX models; sampling quality is evaluated separately, and these exactness checks do not establish the quality effect of precision.</w:t>
       </w:r>
     </w:p>
     <w:p>
@@ -9899,7 +10002,7 @@
         <w:rPr>
           <w:lang w:val="en-GB"/>
         </w:rPr>
-        <w:t xml:space="preserve">On a small invented language NCM is faster and somewhat less accurate than an equal-size AR model. On Sudoku our AR baseline matches the paper’s AR result; our NCM does not match the paper’s NCM.</w:t>
+        <w:t xml:space="preserve">On a small invented language NCM is faster and somewhat less accurate than an AR model with similar generator size. On Sudoku our AR result is near the paper’s AR reference; our NCM does not match the paper’s NCM result.</w:t>
       </w:r>
     </w:p>
     <w:p>
@@ -10102,7 +10205,7 @@
         <w:rPr>
           <w:lang w:val="en-GB"/>
         </w:rPr>
-        <w:t xml:space="preserve">TinyWorld, equal-size NCM and AR models (E1).</w:t>
+        <w:t xml:space="preserve">TinyWorld, NCM and AR with similar generator size (E1); NCM also retains its codec.</w:t>
       </w:r>
     </w:p>
     <w:tbl>
@@ -10111,7 +10214,7 @@
         <w:tblW w:type="pct" w:w="5000"/>
         <w:tblLayout w:type="fixed"/>
         <w:tblLook w:firstRow="1" w:lastRow="0" w:firstColumn="0" w:lastColumn="0" w:noHBand="0" w:noVBand="0" w:val="0020"/>
-        <w:tblCaption w:val="TinyWorld, equal-size NCM and AR models (E1)."/>
+        <w:tblCaption w:val="TinyWorld, NCM and AR with similar generator size (E1); NCM also retains its codec."/>
       </w:tblPr>
       <w:tblGrid>
         <w:gridCol w:w="2640"/>
@@ -10563,7 +10666,7 @@
         <w:rPr>
           <w:lang w:val="en-GB"/>
         </w:rPr>
-        <w:t xml:space="preserve">Sudoku, share of boards solved. Paper rows are quoted from</w:t>
+        <w:t xml:space="preserve">Sudoku, share of boards solved. Params counts generators only for NCM; the codec is additional. Paper rows are reference results from</w:t>
       </w:r>
       <w:r>
         <w:rPr>
@@ -10596,7 +10699,7 @@
         <w:rPr>
           <w:lang w:val="en-GB"/>
         </w:rPr>
-        <w:t xml:space="preserve">.</w:t>
+        <w:t xml:space="preserve">. Budgets differ except for the explicitly matched E11 comparison.</w:t>
       </w:r>
     </w:p>
     <w:tbl>
@@ -10605,7 +10708,7 @@
         <w:tblW w:type="pct" w:w="5000"/>
         <w:tblLayout w:type="fixed"/>
         <w:tblLook w:firstRow="1" w:lastRow="0" w:firstColumn="0" w:lastColumn="0" w:noHBand="0" w:noVBand="0" w:val="0020"/>
-        <w:tblCaption w:val="Sudoku, share of boards solved. Paper rows are quoted from (Kumbong et al. 2026, Table 3)."/>
+        <w:tblCaption w:val="Sudoku, share of boards solved. Params counts generators only for NCM; the codec is additional. Paper rows are reference results from (Kumbong et al. 2026, Table 3). Budgets differ except for the explicitly matched E11 comparison."/>
       </w:tblPr>
       <w:tblGrid>
         <w:gridCol w:w="1584"/>
@@ -11570,7 +11673,54 @@
         <w:rPr>
           <w:lang w:val="en-GB"/>
         </w:rPr>
-        <w:t xml:space="preserve">The AR row matches the paper’s AR row to within two points, which checks the boards, the scoring and the conditioning path. The NCM rows do not match. Without conditioning corruption (E4–E6) our NCM solves nothing; with it (E8) it solves 6.2% of easy boards and fills 74.7% of blank cells correctly, more than the AR model’s 71.0%, while still solving fewer boards. With four times more training data (E11) it solves 55.2% of easy boards and beats the AR model at every difficulty; given the same 2M training sequences, the AR model solves 20.5%, 4.9% and 0.5%, so the advantage is not a budget artefact. Section 8 isolates the steps.</w:t>
+        <w:t xml:space="preserve">The first AR row is within a few percentage points of the paper’s AR reference, but this numerical proximity does not establish a reproduction of its model or training recipe. Without conditioning corruption (E4–E6) our NCM solves nothing; with it (E8) it solves 6.2% of easy boards and fills 74.7% of blank cells correctly, more than the AR model’s 71.0%, while still solving fewer boards. E11 solves 55.2% of easy boards; at the same 2.048M generator presentations, the AR model solves 20.5%, 4.9% and 0.5%. This matches generator data exposure, not total training cost, FLOPs or system size. Section 8 records the changes.</w:t>
+      </w:r>
+    </w:p>
+    <w:p>
+      <w:pPr>
+        <w:pStyle w:val="BodyText"/>
+      </w:pPr>
+      <w:r>
+        <w:rPr>
+          <w:lang w:val="en-GB"/>
+        </w:rPr>
+        <w:t xml:space="preserve">The shared E6 codec contains 13,816,704 gradient-trained values, 49,152 EMA-trained codebook values and 49,344 EMA accumulators: 13,915,200 saved scalar values in total. Its learned first-level down/up convolutions account for 10,617,344 trainable values. The 6,440,128 generator values are additional; generator-size comparisons exclude the codec. For E15, the artifact retains 96.25 / 76.65 / 31.90%; the table preserves historical one-decimal summaries. Each test set has 2,000 boards. Runs generally use one training seed, and repeated sampling seeds do not quantify training variability.</w:t>
+      </w:r>
+    </w:p>
+    <w:p>
+      <w:pPr>
+        <w:pStyle w:val="BodyText"/>
+      </w:pPr>
+      <w:r>
+        <w:rPr>
+          <w:lang w:val="en-GB"/>
+        </w:rPr>
+        <w:t xml:space="preserve">Historical synchronized timings use temperature 1.0 while Sudoku quality uses greedy temperature 0.0. Both samplers remain uncompiled;</w:t>
+      </w:r>
+      <w:r>
+        <w:rPr>
+          <w:lang w:val="en-GB"/>
+        </w:rPr>
+        <w:t xml:space="preserve"> </w:t>
+      </w:r>
+      <w:r>
+        <w:rPr>
+          <w:rStyle w:val="VerbatimChar"/>
+          <w:lang w:val="en-GB"/>
+        </w:rPr>
+        <w:t xml:space="preserve">mx.compile</w:t>
+      </w:r>
+      <w:r>
+        <w:rPr>
+          <w:lang w:val="en-GB"/>
+        </w:rPr>
+        <w:t xml:space="preserve"> </w:t>
+      </w:r>
+      <w:r>
+        <w:rPr>
+          <w:lang w:val="en-GB"/>
+        </w:rPr>
+        <w:t xml:space="preserve">is used only for generator training when configured. Latency therefore does not directly time the solved-board decoding setting. The benchmark includes the output host copy, prefix work and final decoder, and records shared-device contention; cross-hardware timing ratios are not controlled comparisons.</w:t>
       </w:r>
     </w:p>
     <w:p>
@@ -11921,7 +12071,7 @@
         <w:rPr>
           <w:lang w:val="en-GB"/>
         </w:rPr>
-        <w:t xml:space="preserve">Each experiment changed one thing. Experiment numbers (E0, E1, …) follow the order in which they were run; the full record with every number is in</w:t>
+        <w:t xml:space="preserve">The experiments examine architecture, training and data choices; some combine multiple changes. Experiment numbers (E0, E1, …) identify runs; the full record with every number is in</w:t>
       </w:r>
       <w:r>
         <w:rPr>
@@ -13361,7 +13511,7 @@
               <w:rPr>
                 <w:lang w:val="en-GB"/>
               </w:rPr>
-              <w:t xml:space="preserve">Within 3.3 points of the paper on easy, with a quarter of the model and a sixth of the data</w:t>
+              <w:t xml:space="preserve">Within 3.3 points on easy; roughly one quarter of upstream’s generator size and one sixth of generator exposure</w:t>
             </w:r>
           </w:p>
         </w:tc>
@@ -13599,7 +13749,7 @@
         <w:rPr>
           <w:lang w:val="en-GB"/>
         </w:rPr>
-        <w:t xml:space="preserve">The structural speed argument holds on Apple Silicon: with few short levels, NCM’s latency at batch 1–16 is a fraction of an equal-size AR model’s, because each pass reads the weights once for many positions. The advantage shrinks with batch size and with the total number of codes; the 12-level Sudoku model, with 314 codes plus an 81-token prefix, is slower than AR from batch 64 on.</w:t>
+        <w:t xml:space="preserve">The measured Apple Silicon runs show lower NCM latency at batch 1–16 than an AR model with similar generator size. The advantage shrinks with batch size and the number of codes; the historical 12-level Sudoku run, with 314 codes plus an 81-token prefix, is slower than AR from batch 64 on. These shared-device observations do not isolate dispatch, memory traffic or kernel costs.</w:t>
       </w:r>
     </w:p>
     <w:p>
@@ -13921,7 +14071,13 @@
         <w:rPr>
           <w:lang w:val="en-GB"/>
         </w:rPr>
-        <w:t xml:space="preserve">addresses the train–test mismatch that conditioning corruption targets. We found one public project adding PyTorch training loops to the upstream modules (</w:t>
+        <w:t xml:space="preserve">addresses the train–test mismatch that conditioning corruption targets.</w:t>
+      </w:r>
+      <w:r>
+        <w:rPr>
+          <w:lang w:val="en-GB"/>
+        </w:rPr>
+        <w:t xml:space="preserve"> </w:t>
       </w:r>
       <w:hyperlink r:id="rId51">
         <w:r>
@@ -13936,7 +14092,13 @@
         <w:rPr>
           <w:lang w:val="en-GB"/>
         </w:rPr>
-        <w:t xml:space="preserve">) and no other MLX implementation.</w:t>
+        <w:t xml:space="preserve"> </w:t>
+      </w:r>
+      <w:r>
+        <w:rPr>
+          <w:lang w:val="en-GB"/>
+        </w:rPr>
+        <w:t xml:space="preserve">adds PyTorch training loops around upstream modules. The repository’s dated related-work comparison records other implementations; we make no priority claim for this MLX implementation.</w:t>
       </w:r>
     </w:p>
     <w:p>
@@ -13970,7 +14132,7 @@
         <w:rPr>
           <w:lang w:val="en-GB"/>
         </w:rPr>
-        <w:t xml:space="preserve">NCM can be implemented natively in MLX with a provably consistent training and generation path, and on a laptop GPU it delivers the low small-batch latency its design promises. Reproducing its accuracy is a different matter: on Sudoku, matching the published AR baseline was easy and matching NCM was not, and the gap closes slowly as upstream’s recipe is added piece by piece. Conditioning corruption, which addresses the gap between training on true codes and generating from the model’s own, was the single most effective change. A variant based on the model’s own samples, suggested in the paper, did not help (E9). Larger training budgets and real-text evaluation remain to be tested.</w:t>
+        <w:t xml:space="preserve">NCM can be implemented natively in MLX with a training/generation equivalence invariant checked exactly on CPU. These experiments show low small-batch latency and a remaining accuracy gap to upstream Sudoku results. Conditioning corruption addresses the mismatch between true training codes and sampled inference codes; it produced the first solved boards, while increased data exposure improved the result further. Model-sampled corruption did not improve the tested configuration (E9). Larger budgets, repeated training seeds and real-text evaluation remain research work.</w:t>
       </w:r>
     </w:p>
     <w:p>
@@ -14015,13 +14177,7 @@
         <w:rPr>
           <w:lang w:val="en-GB"/>
         </w:rPr>
-        <w:t xml:space="preserve"> </w:t>
-      </w:r>
-      <w:r>
-        <w:rPr>
-          <w:lang w:val="en-GB"/>
-        </w:rPr>
-        <w:t xml:space="preserve">(private until release). Every configuration is in</w:t>
+        <w:t xml:space="preserve">. Every configuration is in</w:t>
       </w:r>
       <w:r>
         <w:rPr>
@@ -14040,7 +14196,7 @@
         <w:rPr>
           <w:lang w:val="en-GB"/>
         </w:rPr>
-        <w:t xml:space="preserve">; every run is logged in</w:t>
+        <w:t xml:space="preserve">; measured runs are logged in</w:t>
       </w:r>
       <w:r>
         <w:rPr>
@@ -14059,7 +14215,7 @@
         <w:rPr>
           <w:lang w:val="en-GB"/>
         </w:rPr>
-        <w:t xml:space="preserve">.</w:t>
+        <w:t xml:space="preserve">. The benchmark guide explains budget matching, parameter accounting, synchronization and uncertainty.</w:t>
       </w:r>
     </w:p>
     <w:p>
@@ -16009,6 +16165,50 @@
                 <w:lang w:val="en-GB"/>
               </w:rPr>
               <w:t xml:space="preserve">Full-state pause/resume and recovery checks; E17’s weights-only continuation solves 71.25% of easy boards, with the optimizer-reset qualification.</w:t>
+            </w:r>
+          </w:p>
+        </w:tc>
+      </w:tr>
+      <w:tr>
+        <w:tc>
+          <w:tcPr/>
+          <w:p>
+            <w:pPr>
+              <w:pStyle w:val="Compact"/>
+            </w:pPr>
+            <w:r>
+              <w:rPr>
+                <w:lang w:val="en-GB"/>
+              </w:rPr>
+              <w:t xml:space="preserve">0.8</w:t>
+            </w:r>
+          </w:p>
+        </w:tc>
+        <w:tc>
+          <w:tcPr/>
+          <w:p>
+            <w:pPr>
+              <w:pStyle w:val="Compact"/>
+            </w:pPr>
+            <w:r>
+              <w:rPr>
+                <w:lang w:val="en-GB"/>
+              </w:rPr>
+              <w:t xml:space="preserve">2026-10-24</w:t>
+            </w:r>
+          </w:p>
+        </w:tc>
+        <w:tc>
+          <w:tcPr/>
+          <w:p>
+            <w:pPr>
+              <w:pStyle w:val="Compact"/>
+            </w:pPr>
+            <w:r>
+              <w:rPr>
+                <w:lang w:val="en-GB"/>
+              </w:rPr>
+              <w:t xml:space="preserve">Release audit: codec/system parameter accounting, budget and sampling qualifications, prior-art scope and simplified visual identity.</w:t>
             </w:r>
           </w:p>
         </w:tc>

</xml_diff>

<commit_message>
Archive paper v0.9 and add persistent research citations
</commit_message>
<xml_diff>
--- a/paper/dist/ncm-mlx.docx
+++ b/paper/dist/ncm-mlx.docx
@@ -32,7 +32,7 @@
         <w:rPr>
           <w:lang w:val="en-GB"/>
         </w:rPr>
-        <w:t xml:space="preserve">v0.8 · 2026-10-24</w:t>
+        <w:t xml:space="preserve">v0.9 · 2026-10-24</w:t>
       </w:r>
     </w:p>
     <w:p>
@@ -76,7 +76,7 @@
         <w:rPr>
           <w:lang w:val="en-GB"/>
         </w:rPr>
-        <w:t xml:space="preserve">Working paper, version 0.8. Every number here is copied from a run in the code repository (</w:t>
+        <w:t xml:space="preserve">Working paper, version 0.9. Every number here is copied from a run in the code repository (</w:t>
       </w:r>
       <w:r>
         <w:rPr>
@@ -291,7 +291,7 @@
         <w:rPr>
           <w:lang w:val="en-GB"/>
         </w:rPr>
-        <w:t xml:space="preserve">(a word or a piece of a word) at a time. To write the 100th token it runs the whole model once, reads what it has written so far and picks the next token. A 100-token answer therefore needs 100 full runs of the model, one after the other. On a laptop each run must read every weight of the model from memory, so speed is limited by memory bandwidth, not by how fast the chip can calculate.</w:t>
+        <w:t xml:space="preserve">(a word or a piece of a word) at a time. To write the 100th token it runs the whole model once, reads what it has written so far and picks the next token. A 100-token answer therefore needs 100 full runs of the model, one after the other. At small batch sizes, autoregressive decoding often spends much of its time moving model weights from memory. The balance depends on the model, hardware, cache and implementation; these experiments measure latency, not memory-bandwidth utilisation.</w:t>
       </w:r>
     </w:p>
     <w:p>
@@ -14313,13 +14313,25 @@
         <w:rPr>
           <w:rStyle w:val="NormalTok"/>
         </w:rPr>
-        <w:t xml:space="preserve"> paper/make_figures.py             </w:t>
+        <w:t xml:space="preserve"> paper/make_figures.py </w:t>
+      </w:r>
+      <w:r>
+        <w:rPr>
+          <w:rStyle w:val="AttributeTok"/>
+        </w:rPr>
+        <w:t xml:space="preserve">--plot</w:t>
+      </w:r>
+      <w:r>
+        <w:rPr>
+          <w:rStyle w:val="NormalTok"/>
+        </w:rPr>
+        <w:t xml:space="preserve">      </w:t>
       </w:r>
       <w:r>
         <w:rPr>
           <w:rStyle w:val="CommentTok"/>
         </w:rPr>
-        <w:t xml:space="preserve"># rebuild data and figures</w:t>
+        <w:t xml:space="preserve"># rebuild figures from committed data</w:t>
       </w:r>
       <w:r>
         <w:br/>
@@ -14347,17 +14359,41 @@
       <w:pPr>
         <w:pStyle w:val="Heading1"/>
       </w:pPr>
-      <w:bookmarkStart w:id="55" w:name="_references"/>
-      <w:r>
-        <w:rPr>
-          <w:lang w:val="en-GB"/>
-        </w:rPr>
-        <w:t xml:space="preserve">References</w:t>
+      <w:bookmarkStart w:id="55" w:name="_a1ac0186124a25a02d676ec397b07176e03c318"/>
+      <w:r>
+        <w:rPr>
+          <w:lang w:val="en-GB"/>
+        </w:rPr>
+        <w:t xml:space="preserve">AI assistance</w:t>
       </w:r>
       <w:bookmarkEnd w:id="55"/>
     </w:p>
-    <w:bookmarkStart w:id="67" w:name="_refs"/>
-    <w:bookmarkStart w:id="56" w:name="_7178c6d97c83436ac51e3d67a795fe1f0539a1f"/>
+    <w:p>
+      <w:pPr>
+        <w:pStyle w:val="FirstParagraph"/>
+      </w:pPr>
+      <w:r>
+        <w:rPr>
+          <w:lang w:val="en-GB"/>
+        </w:rPr>
+        <w:t xml:space="preserve">OpenAI Codex assisted with code, documentation and manuscript drafting and revision. It is not an author. This assistance does not constitute independent verification of the results or human review of the manuscript.</w:t>
+      </w:r>
+    </w:p>
+    <w:p>
+      <w:pPr>
+        <w:pStyle w:val="Heading1"/>
+      </w:pPr>
+      <w:bookmarkStart w:id="56" w:name="_references"/>
+      <w:r>
+        <w:rPr>
+          <w:lang w:val="en-GB"/>
+        </w:rPr>
+        <w:t xml:space="preserve">References</w:t>
+      </w:r>
+      <w:bookmarkEnd w:id="56"/>
+    </w:p>
+    <w:bookmarkStart w:id="68" w:name="_refs"/>
+    <w:bookmarkStart w:id="57" w:name="_7178c6d97c83436ac51e3d67a795fe1f0539a1f"/>
     <w:p>
       <w:pPr>
         <w:pStyle w:val="Bibliography"/>
@@ -14408,8 +14444,8 @@
         <w:t xml:space="preserve">.</w:t>
       </w:r>
     </w:p>
-    <w:bookmarkEnd w:id="56"/>
-    <w:bookmarkStart w:id="58" w:name="_22c2001aa78ad7aea289a48a7ef9956283b8785"/>
+    <w:bookmarkEnd w:id="57"/>
+    <w:bookmarkStart w:id="59" w:name="_22c2001aa78ad7aea289a48a7ef9956283b8785"/>
     <w:p>
       <w:pPr>
         <w:pStyle w:val="Bibliography"/>
@@ -14455,7 +14491,7 @@
         </w:rPr>
         <w:t xml:space="preserve"> </w:t>
       </w:r>
-      <w:hyperlink r:id="rId57">
+      <w:hyperlink r:id="rId58">
         <w:r>
           <w:rPr>
             <w:rStyle w:val="Hyperlink"/>
@@ -14471,8 +14507,8 @@
         <w:t xml:space="preserve">.</w:t>
       </w:r>
     </w:p>
-    <w:bookmarkEnd w:id="58"/>
-    <w:bookmarkStart w:id="59" w:name="_467f4199928b1ab5831cfd23859fbdb18c1801c"/>
+    <w:bookmarkEnd w:id="59"/>
+    <w:bookmarkStart w:id="60" w:name="_467f4199928b1ab5831cfd23859fbdb18c1801c"/>
     <w:p>
       <w:pPr>
         <w:pStyle w:val="Bibliography"/>
@@ -14523,8 +14559,8 @@
         <w:t xml:space="preserve">.</w:t>
       </w:r>
     </w:p>
-    <w:bookmarkEnd w:id="59"/>
-    <w:bookmarkStart w:id="60" w:name="_652dea1f203f9076ff3a92d6c71b61d234bd0a1"/>
+    <w:bookmarkEnd w:id="60"/>
+    <w:bookmarkStart w:id="61" w:name="_652dea1f203f9076ff3a92d6c71b61d234bd0a1"/>
     <w:p>
       <w:pPr>
         <w:pStyle w:val="Bibliography"/>
@@ -14575,8 +14611,8 @@
         <w:t xml:space="preserve">.</w:t>
       </w:r>
     </w:p>
-    <w:bookmarkEnd w:id="60"/>
-    <w:bookmarkStart w:id="61" w:name="_16a5c5d099436b6e8ddbcaaceeaae077a39ab23"/>
+    <w:bookmarkEnd w:id="61"/>
+    <w:bookmarkStart w:id="62" w:name="_16a5c5d099436b6e8ddbcaaceeaae077a39ab23"/>
     <w:p>
       <w:pPr>
         <w:pStyle w:val="Bibliography"/>
@@ -14627,8 +14663,8 @@
         <w:t xml:space="preserve">.</w:t>
       </w:r>
     </w:p>
-    <w:bookmarkEnd w:id="61"/>
-    <w:bookmarkStart w:id="62" w:name="_193777c8a7049c9edc002af66cbb9f7ca9ecd0d"/>
+    <w:bookmarkEnd w:id="62"/>
+    <w:bookmarkStart w:id="63" w:name="_193777c8a7049c9edc002af66cbb9f7ca9ecd0d"/>
     <w:p>
       <w:pPr>
         <w:pStyle w:val="Bibliography"/>
@@ -14679,8 +14715,8 @@
         <w:t xml:space="preserve">.</w:t>
       </w:r>
     </w:p>
-    <w:bookmarkEnd w:id="62"/>
-    <w:bookmarkStart w:id="63" w:name="_9ce0df2006fb1fb2e7d2fff813ee7d4c789115b"/>
+    <w:bookmarkEnd w:id="63"/>
+    <w:bookmarkStart w:id="64" w:name="_9ce0df2006fb1fb2e7d2fff813ee7d4c789115b"/>
     <w:p>
       <w:pPr>
         <w:pStyle w:val="Bibliography"/>
@@ -14731,8 +14767,8 @@
         <w:t xml:space="preserve">.</w:t>
       </w:r>
     </w:p>
-    <w:bookmarkEnd w:id="63"/>
-    <w:bookmarkStart w:id="64" w:name="_6617e1df4c3b4092182fef8ff1d6c88b6e54307"/>
+    <w:bookmarkEnd w:id="64"/>
+    <w:bookmarkStart w:id="65" w:name="_6617e1df4c3b4092182fef8ff1d6c88b6e54307"/>
     <w:p>
       <w:pPr>
         <w:pStyle w:val="Bibliography"/>
@@ -14795,8 +14831,8 @@
         <w:t xml:space="preserve">.</w:t>
       </w:r>
     </w:p>
-    <w:bookmarkEnd w:id="64"/>
-    <w:bookmarkStart w:id="65" w:name="_99c1d1258865f103d21eca3beae1bb24266bd09"/>
+    <w:bookmarkEnd w:id="65"/>
+    <w:bookmarkStart w:id="66" w:name="_99c1d1258865f103d21eca3beae1bb24266bd09"/>
     <w:p>
       <w:pPr>
         <w:pStyle w:val="Bibliography"/>
@@ -14847,8 +14883,8 @@
         <w:t xml:space="preserve">.</w:t>
       </w:r>
     </w:p>
-    <w:bookmarkEnd w:id="65"/>
-    <w:bookmarkStart w:id="66" w:name="_6af57b8dbe9741da011302feeade8167f05cd0b"/>
+    <w:bookmarkEnd w:id="66"/>
+    <w:bookmarkStart w:id="67" w:name="_6af57b8dbe9741da011302feeade8167f05cd0b"/>
     <w:p>
       <w:pPr>
         <w:pStyle w:val="Bibliography"/>
@@ -14899,20 +14935,20 @@
         <w:t xml:space="preserve">.</w:t>
       </w:r>
     </w:p>
-    <w:bookmarkEnd w:id="66"/>
     <w:bookmarkEnd w:id="67"/>
+    <w:bookmarkEnd w:id="68"/>
     <w:p>
       <w:pPr>
         <w:pStyle w:val="Heading1"/>
       </w:pPr>
-      <w:bookmarkStart w:id="68" w:name="_8d22d2f750ed15b9f9dd99947a4572953bd9af3"/>
+      <w:bookmarkStart w:id="69" w:name="_8d22d2f750ed15b9f9dd99947a4572953bd9af3"/>
       <w:r>
         <w:rPr>
           <w:lang w:val="en-GB"/>
         </w:rPr>
         <w:t xml:space="preserve">Appendix A: Hyperparameters</w:t>
       </w:r>
-      <w:bookmarkEnd w:id="68"/>
+      <w:bookmarkEnd w:id="69"/>
     </w:p>
     <w:p>
       <w:pPr>
@@ -15181,21 +15217,21 @@
               <w:rPr>
                 <w:lang w:val="en-GB"/>
               </w:rPr>
-              <w:t xml:space="preserve">4,000 (6e-4)</w:t>
-            </w:r>
-          </w:p>
-        </w:tc>
-        <w:tc>
-          <w:tcPr/>
-          <w:p>
-            <w:pPr>
-              <w:pStyle w:val="Compact"/>
-            </w:pPr>
-            <w:r>
-              <w:rPr>
-                <w:lang w:val="en-GB"/>
-              </w:rPr>
-              <w:t xml:space="preserve">EMA 0.95</w:t>
+              <w:t xml:space="preserve">3,000 (6e-4)</w:t>
+            </w:r>
+          </w:p>
+        </w:tc>
+        <w:tc>
+          <w:tcPr/>
+          <w:p>
+            <w:pPr>
+              <w:pStyle w:val="Compact"/>
+            </w:pPr>
+            <w:r>
+              <w:rPr>
+                <w:lang w:val="en-GB"/>
+              </w:rPr>
+              <w:t xml:space="preserve">EMA 0.95; best step 1,500</w:t>
             </w:r>
           </w:p>
         </w:tc>
@@ -15767,16 +15803,886 @@
     </w:tbl>
     <w:p>
       <w:pPr>
+        <w:pStyle w:val="FirstParagraph"/>
+      </w:pPr>
+      <w:r>
+        <w:rPr>
+          <w:lang w:val="en-GB"/>
+        </w:rPr>
+        <w:t xml:space="preserve">Later Sudoku runs reuse the frozen E6 codec and its 12-level, 16-code hierarchy. All use an 81-cell prefix, eight attention heads, generator seed 0, AdamW with weight decay 0.01, a cosine learning-rate schedule and compiled generator training. Generator dropout is 0.1 at width 256 and 0.2 at width 512; warmup is 200 steps at width 256 and 1,000 at width 512. The codec is additional to the generator sizes below.</w:t>
+      </w:r>
+    </w:p>
+    <w:p>
+      <w:pPr>
+        <w:pStyle w:val="TableCaption"/>
+      </w:pPr>
+      <w:r>
+        <w:rPr>
+          <w:lang w:val="en-GB"/>
+        </w:rPr>
+        <w:t xml:space="preserve">Later Sudoku generator settings. Steps are completed steps for the reported results; corruption gives the first and last replacement probabilities.</w:t>
+      </w:r>
+    </w:p>
+    <w:tbl>
+      <w:tblPr>
+        <w:tblStyle w:val="Table"/>
+        <w:tblW w:type="auto" w:w="0"/>
+        <w:tblLook w:firstRow="1" w:lastRow="0" w:firstColumn="0" w:lastColumn="0" w:noHBand="0" w:noVBand="0" w:val="0020"/>
+        <w:tblCaption w:val="Later Sudoku generator settings. Steps are completed steps for the reported results; corruption gives the first and last replacement probabilities."/>
+      </w:tblPr>
+      <w:tblGrid>
+        <w:gridCol w:w="1320"/>
+        <w:gridCol w:w="1320"/>
+        <w:gridCol w:w="1320"/>
+        <w:gridCol w:w="1320"/>
+        <w:gridCol w:w="1320"/>
+        <w:gridCol w:w="1320"/>
+      </w:tblGrid>
+      <w:tr>
+        <w:trPr>
+          <w:tblHeader w:val="on"/>
+        </w:trPr>
+        <w:tc>
+          <w:tcPr/>
+          <w:p>
+            <w:pPr>
+              <w:pStyle w:val="Compact"/>
+            </w:pPr>
+            <w:r>
+              <w:rPr>
+                <w:lang w:val="en-GB"/>
+              </w:rPr>
+              <w:t xml:space="preserve">Run</w:t>
+            </w:r>
+          </w:p>
+        </w:tc>
+        <w:tc>
+          <w:tcPr/>
+          <w:p>
+            <w:pPr>
+              <w:pStyle w:val="Compact"/>
+            </w:pPr>
+            <w:r>
+              <w:rPr>
+                <w:lang w:val="en-GB"/>
+              </w:rPr>
+              <w:t xml:space="preserve">Generator</w:t>
+            </w:r>
+          </w:p>
+        </w:tc>
+        <w:tc>
+          <w:tcPr/>
+          <w:p>
+            <w:pPr>
+              <w:pStyle w:val="Compact"/>
+            </w:pPr>
+            <w:r>
+              <w:rPr>
+                <w:lang w:val="en-GB"/>
+              </w:rPr>
+              <w:t xml:space="preserve">Steps</w:t>
+            </w:r>
+          </w:p>
+        </w:tc>
+        <w:tc>
+          <w:tcPr/>
+          <w:p>
+            <w:pPr>
+              <w:pStyle w:val="Compact"/>
+            </w:pPr>
+            <w:r>
+              <w:rPr>
+                <w:lang w:val="en-GB"/>
+              </w:rPr>
+              <w:t xml:space="preserve">Batch</w:t>
+            </w:r>
+          </w:p>
+        </w:tc>
+        <w:tc>
+          <w:tcPr/>
+          <w:p>
+            <w:pPr>
+              <w:pStyle w:val="Compact"/>
+            </w:pPr>
+            <w:r>
+              <w:rPr>
+                <w:lang w:val="en-GB"/>
+              </w:rPr>
+              <w:t xml:space="preserve">Learning rate</w:t>
+            </w:r>
+          </w:p>
+        </w:tc>
+        <w:tc>
+          <w:tcPr/>
+          <w:p>
+            <w:pPr>
+              <w:pStyle w:val="Compact"/>
+            </w:pPr>
+            <w:r>
+              <w:rPr>
+                <w:lang w:val="en-GB"/>
+              </w:rPr>
+              <w:t xml:space="preserve">Corruption</w:t>
+            </w:r>
+          </w:p>
+        </w:tc>
+      </w:tr>
+      <w:tr>
+        <w:tc>
+          <w:tcPr/>
+          <w:p>
+            <w:pPr>
+              <w:pStyle w:val="Compact"/>
+            </w:pPr>
+            <w:r>
+              <w:rPr>
+                <w:lang w:val="en-GB"/>
+              </w:rPr>
+              <w:t xml:space="preserve">E10</w:t>
+            </w:r>
+          </w:p>
+        </w:tc>
+        <w:tc>
+          <w:tcPr/>
+          <w:p>
+            <w:pPr>
+              <w:pStyle w:val="Compact"/>
+            </w:pPr>
+            <w:r>
+              <w:rPr>
+                <w:lang w:val="en-GB"/>
+              </w:rPr>
+              <w:t xml:space="preserve">8 × 512</w:t>
+            </w:r>
+          </w:p>
+        </w:tc>
+        <w:tc>
+          <w:tcPr/>
+          <w:p>
+            <w:pPr>
+              <w:pStyle w:val="Compact"/>
+            </w:pPr>
+            <w:r>
+              <w:rPr>
+                <w:lang w:val="en-GB"/>
+              </w:rPr>
+              <w:t xml:space="preserve">24,000</w:t>
+            </w:r>
+          </w:p>
+        </w:tc>
+        <w:tc>
+          <w:tcPr/>
+          <w:p>
+            <w:pPr>
+              <w:pStyle w:val="Compact"/>
+            </w:pPr>
+            <w:r>
+              <w:rPr>
+                <w:lang w:val="en-GB"/>
+              </w:rPr>
+              <w:t xml:space="preserve">64</w:t>
+            </w:r>
+          </w:p>
+        </w:tc>
+        <w:tc>
+          <w:tcPr/>
+          <w:p>
+            <w:pPr>
+              <w:pStyle w:val="Compact"/>
+            </w:pPr>
+            <w:r>
+              <w:rPr>
+                <w:lang w:val="en-GB"/>
+              </w:rPr>
+              <w:t xml:space="preserve">3e-4</w:t>
+            </w:r>
+          </w:p>
+        </w:tc>
+        <w:tc>
+          <w:tcPr/>
+          <w:p>
+            <w:pPr>
+              <w:pStyle w:val="Compact"/>
+            </w:pPr>
+            <w:r>
+              <w:rPr>
+                <w:lang w:val="en-GB"/>
+              </w:rPr>
+              <w:t xml:space="preserve">0.30 → 0.05</w:t>
+            </w:r>
+          </w:p>
+        </w:tc>
+      </w:tr>
+      <w:tr>
+        <w:tc>
+          <w:tcPr/>
+          <w:p>
+            <w:pPr>
+              <w:pStyle w:val="Compact"/>
+            </w:pPr>
+            <w:r>
+              <w:rPr>
+                <w:lang w:val="en-GB"/>
+              </w:rPr>
+              <w:t xml:space="preserve">E11</w:t>
+            </w:r>
+          </w:p>
+        </w:tc>
+        <w:tc>
+          <w:tcPr/>
+          <w:p>
+            <w:pPr>
+              <w:pStyle w:val="Compact"/>
+            </w:pPr>
+            <w:r>
+              <w:rPr>
+                <w:lang w:val="en-GB"/>
+              </w:rPr>
+              <w:t xml:space="preserve">8 × 256</w:t>
+            </w:r>
+          </w:p>
+        </w:tc>
+        <w:tc>
+          <w:tcPr/>
+          <w:p>
+            <w:pPr>
+              <w:pStyle w:val="Compact"/>
+            </w:pPr>
+            <w:r>
+              <w:rPr>
+                <w:lang w:val="en-GB"/>
+              </w:rPr>
+              <w:t xml:space="preserve">32,000</w:t>
+            </w:r>
+          </w:p>
+        </w:tc>
+        <w:tc>
+          <w:tcPr/>
+          <w:p>
+            <w:pPr>
+              <w:pStyle w:val="Compact"/>
+            </w:pPr>
+            <w:r>
+              <w:rPr>
+                <w:lang w:val="en-GB"/>
+              </w:rPr>
+              <w:t xml:space="preserve">64</w:t>
+            </w:r>
+          </w:p>
+        </w:tc>
+        <w:tc>
+          <w:tcPr/>
+          <w:p>
+            <w:pPr>
+              <w:pStyle w:val="Compact"/>
+            </w:pPr>
+            <w:r>
+              <w:rPr>
+                <w:lang w:val="en-GB"/>
+              </w:rPr>
+              <w:t xml:space="preserve">6e-4</w:t>
+            </w:r>
+          </w:p>
+        </w:tc>
+        <w:tc>
+          <w:tcPr/>
+          <w:p>
+            <w:pPr>
+              <w:pStyle w:val="Compact"/>
+            </w:pPr>
+            <w:r>
+              <w:rPr>
+                <w:lang w:val="en-GB"/>
+              </w:rPr>
+              <w:t xml:space="preserve">0.30 → 0.05</w:t>
+            </w:r>
+          </w:p>
+        </w:tc>
+      </w:tr>
+      <w:tr>
+        <w:tc>
+          <w:tcPr/>
+          <w:p>
+            <w:pPr>
+              <w:pStyle w:val="Compact"/>
+            </w:pPr>
+            <w:r>
+              <w:rPr>
+                <w:lang w:val="en-GB"/>
+              </w:rPr>
+              <w:t xml:space="preserve">E12</w:t>
+            </w:r>
+          </w:p>
+        </w:tc>
+        <w:tc>
+          <w:tcPr/>
+          <w:p>
+            <w:pPr>
+              <w:pStyle w:val="Compact"/>
+            </w:pPr>
+            <w:r>
+              <w:rPr>
+                <w:lang w:val="en-GB"/>
+              </w:rPr>
+              <w:t xml:space="preserve">8 × 512</w:t>
+            </w:r>
+          </w:p>
+        </w:tc>
+        <w:tc>
+          <w:tcPr/>
+          <w:p>
+            <w:pPr>
+              <w:pStyle w:val="Compact"/>
+            </w:pPr>
+            <w:r>
+              <w:rPr>
+                <w:lang w:val="en-GB"/>
+              </w:rPr>
+              <w:t xml:space="preserve">50,776</w:t>
+            </w:r>
+          </w:p>
+        </w:tc>
+        <w:tc>
+          <w:tcPr/>
+          <w:p>
+            <w:pPr>
+              <w:pStyle w:val="Compact"/>
+            </w:pPr>
+            <w:r>
+              <w:rPr>
+                <w:lang w:val="en-GB"/>
+              </w:rPr>
+              <w:t xml:space="preserve">64</w:t>
+            </w:r>
+          </w:p>
+        </w:tc>
+        <w:tc>
+          <w:tcPr/>
+          <w:p>
+            <w:pPr>
+              <w:pStyle w:val="Compact"/>
+            </w:pPr>
+            <w:r>
+              <w:rPr>
+                <w:lang w:val="en-GB"/>
+              </w:rPr>
+              <w:t xml:space="preserve">3e-4</w:t>
+            </w:r>
+          </w:p>
+        </w:tc>
+        <w:tc>
+          <w:tcPr/>
+          <w:p>
+            <w:pPr>
+              <w:pStyle w:val="Compact"/>
+            </w:pPr>
+            <w:r>
+              <w:rPr>
+                <w:lang w:val="en-GB"/>
+              </w:rPr>
+              <w:t xml:space="preserve">0.50 → 0.10</w:t>
+            </w:r>
+          </w:p>
+        </w:tc>
+      </w:tr>
+      <w:tr>
+        <w:tc>
+          <w:tcPr/>
+          <w:p>
+            <w:pPr>
+              <w:pStyle w:val="Compact"/>
+            </w:pPr>
+            <w:r>
+              <w:rPr>
+                <w:lang w:val="en-GB"/>
+              </w:rPr>
+              <w:t xml:space="preserve">E13</w:t>
+            </w:r>
+          </w:p>
+        </w:tc>
+        <w:tc>
+          <w:tcPr/>
+          <w:p>
+            <w:pPr>
+              <w:pStyle w:val="Compact"/>
+            </w:pPr>
+            <w:r>
+              <w:rPr>
+                <w:lang w:val="en-GB"/>
+              </w:rPr>
+              <w:t xml:space="preserve">8 × 256</w:t>
+            </w:r>
+          </w:p>
+        </w:tc>
+        <w:tc>
+          <w:tcPr/>
+          <w:p>
+            <w:pPr>
+              <w:pStyle w:val="Compact"/>
+            </w:pPr>
+            <w:r>
+              <w:rPr>
+                <w:lang w:val="en-GB"/>
+              </w:rPr>
+              <w:t xml:space="preserve">32,000</w:t>
+            </w:r>
+          </w:p>
+        </w:tc>
+        <w:tc>
+          <w:tcPr/>
+          <w:p>
+            <w:pPr>
+              <w:pStyle w:val="Compact"/>
+            </w:pPr>
+            <w:r>
+              <w:rPr>
+                <w:lang w:val="en-GB"/>
+              </w:rPr>
+              <w:t xml:space="preserve">64</w:t>
+            </w:r>
+          </w:p>
+        </w:tc>
+        <w:tc>
+          <w:tcPr/>
+          <w:p>
+            <w:pPr>
+              <w:pStyle w:val="Compact"/>
+            </w:pPr>
+            <w:r>
+              <w:rPr>
+                <w:lang w:val="en-GB"/>
+              </w:rPr>
+              <w:t xml:space="preserve">6e-4</w:t>
+            </w:r>
+          </w:p>
+        </w:tc>
+        <w:tc>
+          <w:tcPr/>
+          <w:p>
+            <w:pPr>
+              <w:pStyle w:val="Compact"/>
+            </w:pPr>
+            <w:r>
+              <w:rPr>
+                <w:lang w:val="en-GB"/>
+              </w:rPr>
+              <w:t xml:space="preserve">0.50 → 0.10</w:t>
+            </w:r>
+          </w:p>
+        </w:tc>
+      </w:tr>
+      <w:tr>
+        <w:tc>
+          <w:tcPr/>
+          <w:p>
+            <w:pPr>
+              <w:pStyle w:val="Compact"/>
+            </w:pPr>
+            <w:r>
+              <w:rPr>
+                <w:lang w:val="en-GB"/>
+              </w:rPr>
+              <w:t xml:space="preserve">E14</w:t>
+            </w:r>
+          </w:p>
+        </w:tc>
+        <w:tc>
+          <w:tcPr/>
+          <w:p>
+            <w:pPr>
+              <w:pStyle w:val="Compact"/>
+            </w:pPr>
+            <w:r>
+              <w:rPr>
+                <w:lang w:val="en-GB"/>
+              </w:rPr>
+              <w:t xml:space="preserve">8 × 256</w:t>
+            </w:r>
+          </w:p>
+        </w:tc>
+        <w:tc>
+          <w:tcPr/>
+          <w:p>
+            <w:pPr>
+              <w:pStyle w:val="Compact"/>
+            </w:pPr>
+            <w:r>
+              <w:rPr>
+                <w:lang w:val="en-GB"/>
+              </w:rPr>
+              <w:t xml:space="preserve">128,000</w:t>
+            </w:r>
+          </w:p>
+        </w:tc>
+        <w:tc>
+          <w:tcPr/>
+          <w:p>
+            <w:pPr>
+              <w:pStyle w:val="Compact"/>
+            </w:pPr>
+            <w:r>
+              <w:rPr>
+                <w:lang w:val="en-GB"/>
+              </w:rPr>
+              <w:t xml:space="preserve">64</w:t>
+            </w:r>
+          </w:p>
+        </w:tc>
+        <w:tc>
+          <w:tcPr/>
+          <w:p>
+            <w:pPr>
+              <w:pStyle w:val="Compact"/>
+            </w:pPr>
+            <w:r>
+              <w:rPr>
+                <w:lang w:val="en-GB"/>
+              </w:rPr>
+              <w:t xml:space="preserve">6e-4</w:t>
+            </w:r>
+          </w:p>
+        </w:tc>
+        <w:tc>
+          <w:tcPr/>
+          <w:p>
+            <w:pPr>
+              <w:pStyle w:val="Compact"/>
+            </w:pPr>
+            <w:r>
+              <w:rPr>
+                <w:lang w:val="en-GB"/>
+              </w:rPr>
+              <w:t xml:space="preserve">0.30 → 0.05</w:t>
+            </w:r>
+          </w:p>
+        </w:tc>
+      </w:tr>
+      <w:tr>
+        <w:tc>
+          <w:tcPr/>
+          <w:p>
+            <w:pPr>
+              <w:pStyle w:val="Compact"/>
+            </w:pPr>
+            <w:r>
+              <w:rPr>
+                <w:lang w:val="en-GB"/>
+              </w:rPr>
+              <w:t xml:space="preserve">E15</w:t>
+            </w:r>
+          </w:p>
+        </w:tc>
+        <w:tc>
+          <w:tcPr/>
+          <w:p>
+            <w:pPr>
+              <w:pStyle w:val="Compact"/>
+            </w:pPr>
+            <w:r>
+              <w:rPr>
+                <w:lang w:val="en-GB"/>
+              </w:rPr>
+              <w:t xml:space="preserve">8 × 256</w:t>
+            </w:r>
+          </w:p>
+        </w:tc>
+        <w:tc>
+          <w:tcPr/>
+          <w:p>
+            <w:pPr>
+              <w:pStyle w:val="Compact"/>
+            </w:pPr>
+            <w:r>
+              <w:rPr>
+                <w:lang w:val="en-GB"/>
+              </w:rPr>
+              <w:t xml:space="preserve">128,000</w:t>
+            </w:r>
+          </w:p>
+        </w:tc>
+        <w:tc>
+          <w:tcPr/>
+          <w:p>
+            <w:pPr>
+              <w:pStyle w:val="Compact"/>
+            </w:pPr>
+            <w:r>
+              <w:rPr>
+                <w:lang w:val="en-GB"/>
+              </w:rPr>
+              <w:t xml:space="preserve">64</w:t>
+            </w:r>
+          </w:p>
+        </w:tc>
+        <w:tc>
+          <w:tcPr/>
+          <w:p>
+            <w:pPr>
+              <w:pStyle w:val="Compact"/>
+            </w:pPr>
+            <w:r>
+              <w:rPr>
+                <w:lang w:val="en-GB"/>
+              </w:rPr>
+              <w:t xml:space="preserve">6e-4</w:t>
+            </w:r>
+          </w:p>
+        </w:tc>
+        <w:tc>
+          <w:tcPr/>
+          <w:p>
+            <w:pPr>
+              <w:pStyle w:val="Compact"/>
+            </w:pPr>
+            <w:r>
+              <w:rPr>
+                <w:lang w:val="en-GB"/>
+              </w:rPr>
+              <w:t xml:space="preserve">0.50 → 0.10</w:t>
+            </w:r>
+          </w:p>
+        </w:tc>
+      </w:tr>
+      <w:tr>
+        <w:tc>
+          <w:tcPr/>
+          <w:p>
+            <w:pPr>
+              <w:pStyle w:val="Compact"/>
+            </w:pPr>
+            <w:r>
+              <w:rPr>
+                <w:lang w:val="en-GB"/>
+              </w:rPr>
+              <w:t xml:space="preserve">E16</w:t>
+            </w:r>
+          </w:p>
+        </w:tc>
+        <w:tc>
+          <w:tcPr/>
+          <w:p>
+            <w:pPr>
+              <w:pStyle w:val="Compact"/>
+            </w:pPr>
+            <w:r>
+              <w:rPr>
+                <w:lang w:val="en-GB"/>
+              </w:rPr>
+              <w:t xml:space="preserve">8 × 256</w:t>
+            </w:r>
+          </w:p>
+        </w:tc>
+        <w:tc>
+          <w:tcPr/>
+          <w:p>
+            <w:pPr>
+              <w:pStyle w:val="Compact"/>
+            </w:pPr>
+            <w:r>
+              <w:rPr>
+                <w:lang w:val="en-GB"/>
+              </w:rPr>
+              <w:t xml:space="preserve">32,000</w:t>
+            </w:r>
+          </w:p>
+        </w:tc>
+        <w:tc>
+          <w:tcPr/>
+          <w:p>
+            <w:pPr>
+              <w:pStyle w:val="Compact"/>
+            </w:pPr>
+            <w:r>
+              <w:rPr>
+                <w:lang w:val="en-GB"/>
+              </w:rPr>
+              <w:t xml:space="preserve">64</w:t>
+            </w:r>
+          </w:p>
+        </w:tc>
+        <w:tc>
+          <w:tcPr/>
+          <w:p>
+            <w:pPr>
+              <w:pStyle w:val="Compact"/>
+            </w:pPr>
+            <w:r>
+              <w:rPr>
+                <w:lang w:val="en-GB"/>
+              </w:rPr>
+              <w:t xml:space="preserve">6e-4</w:t>
+            </w:r>
+          </w:p>
+        </w:tc>
+        <w:tc>
+          <w:tcPr/>
+          <w:p>
+            <w:pPr>
+              <w:pStyle w:val="Compact"/>
+            </w:pPr>
+            <w:r>
+              <w:rPr>
+                <w:lang w:val="en-GB"/>
+              </w:rPr>
+              <w:t xml:space="preserve">0.50 → 0.10</w:t>
+            </w:r>
+          </w:p>
+        </w:tc>
+      </w:tr>
+      <w:tr>
+        <w:tc>
+          <w:tcPr/>
+          <w:p>
+            <w:pPr>
+              <w:pStyle w:val="Compact"/>
+            </w:pPr>
+            <w:r>
+              <w:rPr>
+                <w:lang w:val="en-GB"/>
+              </w:rPr>
+              <w:t xml:space="preserve">E17</w:t>
+            </w:r>
+          </w:p>
+        </w:tc>
+        <w:tc>
+          <w:tcPr/>
+          <w:p>
+            <w:pPr>
+              <w:pStyle w:val="Compact"/>
+            </w:pPr>
+            <w:r>
+              <w:rPr>
+                <w:lang w:val="en-GB"/>
+              </w:rPr>
+              <w:t xml:space="preserve">8 × 256</w:t>
+            </w:r>
+          </w:p>
+        </w:tc>
+        <w:tc>
+          <w:tcPr/>
+          <w:p>
+            <w:pPr>
+              <w:pStyle w:val="Compact"/>
+            </w:pPr>
+            <w:r>
+              <w:rPr>
+                <w:lang w:val="en-GB"/>
+              </w:rPr>
+              <w:t xml:space="preserve">32,000</w:t>
+            </w:r>
+          </w:p>
+        </w:tc>
+        <w:tc>
+          <w:tcPr/>
+          <w:p>
+            <w:pPr>
+              <w:pStyle w:val="Compact"/>
+            </w:pPr>
+            <w:r>
+              <w:rPr>
+                <w:lang w:val="en-GB"/>
+              </w:rPr>
+              <w:t xml:space="preserve">64</w:t>
+            </w:r>
+          </w:p>
+        </w:tc>
+        <w:tc>
+          <w:tcPr/>
+          <w:p>
+            <w:pPr>
+              <w:pStyle w:val="Compact"/>
+            </w:pPr>
+            <w:r>
+              <w:rPr>
+                <w:lang w:val="en-GB"/>
+              </w:rPr>
+              <w:t xml:space="preserve">6e-4</w:t>
+            </w:r>
+          </w:p>
+        </w:tc>
+        <w:tc>
+          <w:tcPr/>
+          <w:p>
+            <w:pPr>
+              <w:pStyle w:val="Compact"/>
+            </w:pPr>
+            <w:r>
+              <w:rPr>
+                <w:lang w:val="en-GB"/>
+              </w:rPr>
+              <w:t xml:space="preserve">0.50 → 0.10</w:t>
+            </w:r>
+          </w:p>
+        </w:tc>
+      </w:tr>
+    </w:tbl>
+    <w:p>
+      <w:pPr>
+        <w:pStyle w:val="FirstParagraph"/>
+      </w:pPr>
+      <w:r>
+        <w:rPr>
+          <w:lang w:val="en-GB"/>
+        </w:rPr>
+        <w:t xml:space="preserve">The base data are 200,000 training puzzles and 1,000 validation puzzles, with split seed 0 and 28–45 givens. E15 adds one million greedy-unique puzzles for each seed 201–204; E16 adds one million for each seed 205–206. E17 adds the unique subset of one million random-removal candidates for each seed 101–104; its final 2,000 steps are a weights-only continuation with reset optimizer and random state (Section 6.5). E12’s recorded run completed 50,776 steps; the repository’s current E12 configuration specifies 200,000, so running that configuration unchanged does not reproduce the reported exposure. Full settings and checkpoint prerequisites are in the corresponding</w:t>
+      </w:r>
+      <w:r>
+        <w:rPr>
+          <w:lang w:val="en-GB"/>
+        </w:rPr>
+        <w:t xml:space="preserve"> </w:t>
+      </w:r>
+      <w:r>
+        <w:rPr>
+          <w:rStyle w:val="VerbatimChar"/>
+          <w:lang w:val="en-GB"/>
+        </w:rPr>
+        <w:t xml:space="preserve">configs/sudoku-e*.json</w:t>
+      </w:r>
+      <w:r>
+        <w:rPr>
+          <w:lang w:val="en-GB"/>
+        </w:rPr>
+        <w:t xml:space="preserve"> </w:t>
+      </w:r>
+      <w:r>
+        <w:rPr>
+          <w:lang w:val="en-GB"/>
+        </w:rPr>
+        <w:t xml:space="preserve">files and</w:t>
+      </w:r>
+      <w:r>
+        <w:rPr>
+          <w:lang w:val="en-GB"/>
+        </w:rPr>
+        <w:t xml:space="preserve"> </w:t>
+      </w:r>
+      <w:r>
+        <w:rPr>
+          <w:rStyle w:val="VerbatimChar"/>
+          <w:lang w:val="en-GB"/>
+        </w:rPr>
+        <w:t xml:space="preserve">docs/EXPERIMENTS.md</w:t>
+      </w:r>
+      <w:r>
+        <w:rPr>
+          <w:lang w:val="en-GB"/>
+        </w:rPr>
+        <w:t xml:space="preserve">.</w:t>
+      </w:r>
+    </w:p>
+    <w:p>
+      <w:pPr>
         <w:pStyle w:val="Heading1"/>
       </w:pPr>
-      <w:bookmarkStart w:id="69" w:name="_267f4a9aaa72a933142e09d7546704f4222ae97"/>
+      <w:bookmarkStart w:id="70" w:name="_267f4a9aaa72a933142e09d7546704f4222ae97"/>
       <w:r>
         <w:rPr>
           <w:lang w:val="en-GB"/>
         </w:rPr>
         <w:t xml:space="preserve">Appendix B: Environment</w:t>
       </w:r>
-      <w:bookmarkEnd w:id="69"/>
+      <w:bookmarkEnd w:id="70"/>
     </w:p>
     <w:p>
       <w:pPr>
@@ -15793,14 +16699,14 @@
       <w:pPr>
         <w:pStyle w:val="Heading1"/>
       </w:pPr>
-      <w:bookmarkStart w:id="70" w:name="_4e54121e4b113b611ef349ccf43bc3e3e0477ac"/>
+      <w:bookmarkStart w:id="71" w:name="_4e54121e4b113b611ef349ccf43bc3e3e0477ac"/>
       <w:r>
         <w:rPr>
           <w:lang w:val="en-GB"/>
         </w:rPr>
         <w:t xml:space="preserve">Appendix C: Version history</w:t>
       </w:r>
-      <w:bookmarkEnd w:id="70"/>
+      <w:bookmarkEnd w:id="71"/>
     </w:p>
     <w:tbl>
       <w:tblPr>
@@ -16209,6 +17115,50 @@
                 <w:lang w:val="en-GB"/>
               </w:rPr>
               <w:t xml:space="preserve">Release audit: codec/system parameter accounting, budget and sampling qualifications, prior-art scope and simplified visual identity.</w:t>
+            </w:r>
+          </w:p>
+        </w:tc>
+      </w:tr>
+      <w:tr>
+        <w:tc>
+          <w:tcPr/>
+          <w:p>
+            <w:pPr>
+              <w:pStyle w:val="Compact"/>
+            </w:pPr>
+            <w:r>
+              <w:rPr>
+                <w:lang w:val="en-GB"/>
+              </w:rPr>
+              <w:t xml:space="preserve">0.9</w:t>
+            </w:r>
+          </w:p>
+        </w:tc>
+        <w:tc>
+          <w:tcPr/>
+          <w:p>
+            <w:pPr>
+              <w:pStyle w:val="Compact"/>
+            </w:pPr>
+            <w:r>
+              <w:rPr>
+                <w:lang w:val="en-GB"/>
+              </w:rPr>
+              <w:t xml:space="preserve">2026-10-24</w:t>
+            </w:r>
+          </w:p>
+        </w:tc>
+        <w:tc>
+          <w:tcPr/>
+          <w:p>
+            <w:pPr>
+              <w:pStyle w:val="Compact"/>
+            </w:pPr>
+            <w:r>
+              <w:rPr>
+                <w:lang w:val="en-GB"/>
+              </w:rPr>
+              <w:t xml:space="preserve">Submission preparation: public-data figure rebuild command, qualified memory-bandwidth discussion, later Sudoku settings and AI assistance disclosure.</w:t>
             </w:r>
           </w:p>
         </w:tc>

</xml_diff>

<commit_message>
Report E20 replication and assess the next research phase
</commit_message>
<xml_diff>
--- a/paper/dist/ncm-mlx.docx
+++ b/paper/dist/ncm-mlx.docx
@@ -32,7 +32,7 @@
         <w:rPr>
           <w:lang w:val="en-GB"/>
         </w:rPr>
-        <w:t xml:space="preserve">v0.10 · 2026-10-25</w:t>
+        <w:t xml:space="preserve">v0.11 · 2026-10-27</w:t>
       </w:r>
     </w:p>
     <w:p>
@@ -51,7 +51,7 @@
         <w:rPr>
           <w:lang w:val="en-GB"/>
         </w:rPr>
-        <w:t xml:space="preserve">Next-concept modeling (NCM) writes a sequence the way a painter works: a rough sketch first, then finer and finer detail, with every piece of a level produced at once. We independently implement NCM from its paper and released configurations in MLX, Apple’s array framework, and study it on an Apple M5 Pro laptop and single NVIDIA GPUs. On a synthetic 15,360-sentence language, a 5M-parameter NCM generator is faster than a character-level autoregressive (AR) model of similar generator size at small batches but less accurate (89.8% vs 98.6% valid sentences). On the published Sudoku boards, the MLX implementation with conditioning corruption and unique-solution puzzles solves 98.10% of easy, 83.40% of medium and 40.30% of hard boards after 16.384M generator presentations. This single-seed result improves on 96.25%, 76.65% and 31.90% at half that exposure; corpus, batch and schedule also differ, so the comparison does not isolate a causal effect. Original NCM (Kumbong et al.) reports 99.5%, 96.5% and 86.1% with a roughly 4× larger generator and 51.2M presentations; this is an unmatched comparison. A separate 2.048M-presentation comparison favors NCM over the AR baseline, but excludes NCM’s additional codec training cost. We trace the effects of the level schedule, learned first level, conditioning corruption and training exposure. We also measure reduced precision in fp32 matrix products on Apple GPUs and a 1.35× training improvement from segmented block-diagonal attention.</w:t>
+        <w:t xml:space="preserve">Next-Concept Modeling (NCM) generates a sequence through successive levels of discrete latent codes, predicting each level in parallel. We independently implement the method in MLX and study synthetic language and Sudoku on Apple Silicon and NVIDIA GPUs. On a finite synthetic grammar, a 5M-parameter generator achieves lower small-batch latency than a similarly sized autoregressive generator, with lower sentence validity (89.8% versus 98.6%). Two Sudoku training seeds use the same 6.44M-parameter generator recipe and 16.384M presentations each. Retained greedy evaluation aggregates report easy/medium/hard solve rates of 98.10/83.40/40.30% for seed 0 and 97.25/79.60/33.25% for seed 1, with 2,000 boards per difficulty. The hard-set difference is 7.05 percentage points; two seeds do not establish population training variability or its cause. Original NCM reports 99.50/96.50/86.10% with a 25.46M generator, 51.2M presentations and a different task setup. Our generator is 3.95 times smaller, excluding its additional codec; the comparison establishes neither task parity nor matched-cost efficiency. E20 completes its schedule without a recorded reset or truncation, but missing per-board predictions and remote provenance manifests limit independent audit. We characterize this phase as a partial implementation and small-model success, retain the substantial hard-Sudoku deficit, and define controlled text evaluation as the next research direction rather than a demonstrated capability.</w:t>
       </w:r>
     </w:p>
     <w:p>
@@ -76,7 +76,7 @@
         <w:rPr>
           <w:lang w:val="en-GB"/>
         </w:rPr>
-        <w:t xml:space="preserve">Working paper, version 0.10. Every number here is copied from a run in the code repository (</w:t>
+        <w:t xml:space="preserve">Working paper, version 0.11. Every number here is copied from a run in the code repository (</w:t>
       </w:r>
       <w:r>
         <w:rPr>
@@ -774,7 +774,7 @@
         <w:rPr>
           <w:lang w:val="en-GB"/>
         </w:rPr>
-        <w:t xml:space="preserve">, tested it on a small invented language and on Sudoku puzzles (the original paper’s showcase), and compared it with a character-level AR model of similar generator size and with a large chat model. The speed advantage holds on a laptop. On Sudoku our best model solves 98% of easy boards (the original: 99.5%) and beats the smaller-budget AR reference; a separate comparison matches generator presentations; Section 8 tells how we got there.</w:t>
+        <w:t xml:space="preserve">, tested it on a small invented language and on Sudoku puzzles (the original paper’s showcase), and compared it with a character-level AR model of similar generator size and with a large chat model. The speed advantage holds on a laptop. On Sudoku, two training seeds solve 97.25–98.10% of easy boards but only 33.25–40.30% of hard boards. Original NCM reports 99.5% and 86.1%, respectively, under a different setup. A historical comparison matches generator presentations against our AR baseline; Section 8 records the experiments. NCM is a generation method used here for two tasks, not a Sudoku-specific expansion of the term or an instruction-following language model.</w:t>
       </w:r>
     </w:p>
     <w:p>
@@ -9148,7 +9148,7 @@
         <w:rPr>
           <w:lang w:val="en-GB"/>
         </w:rPr>
-        <w:t xml:space="preserve">Differences between this implementation and the released NCM Sudoku setting</w:t>
+        <w:t xml:space="preserve">Initial E6 settings versus released Original NCM Sudoku settings</w:t>
       </w:r>
       <w:r>
         <w:rPr>
@@ -9181,7 +9181,7 @@
         <w:rPr>
           <w:lang w:val="en-GB"/>
         </w:rPr>
-        <w:t xml:space="preserve">.</w:t>
+        <w:t xml:space="preserve">. Later runs change exposure and corruption; see Appendix A.</w:t>
       </w:r>
     </w:p>
     <w:tbl>
@@ -9190,7 +9190,7 @@
         <w:tblW w:type="dxa" w:w="9360"/>
         <w:tblLayout w:type="fixed"/>
         <w:tblLook w:firstRow="1" w:lastRow="0" w:firstColumn="0" w:lastColumn="0" w:noHBand="0" w:noVBand="0" w:val="0020"/>
-        <w:tblCaption w:val="Differences between this implementation and the released NCM Sudoku setting (Kumbong et al. 2026, Tables 5–6)."/>
+        <w:tblCaption w:val="Initial E6 settings versus released Original NCM Sudoku settings (Kumbong et al. 2026, Tables 5–6). Later runs change exposure and corruption; see Appendix A."/>
         <w:tblInd w:w="0" w:type="dxa"/>
         <w:tblCellMar>
           <w:left w:w="100" w:type="dxa"/>
@@ -9280,7 +9280,7 @@
                 <w:szCs w:val="21"/>
                 <w:b/>
               </w:rPr>
-              <w:t xml:space="preserve">MLX implementation</w:t>
+              <w:t xml:space="preserve">MLX starting recipe (E6)</w:t>
             </w:r>
           </w:p>
         </w:tc>
@@ -12538,13 +12538,11 @@
             </w:pPr>
             <w:r>
               <w:rPr>
-                <w:b/>
-                <w:bCs/>
-                <w:lang w:val="en-GB"/>
-                <w:sz w:val="21"/>
-                <w:szCs w:val="21"/>
-              </w:rPr>
-              <w:t xml:space="preserve">MLX implementation, E19 funded</w:t>
+                <w:lang w:val="en-GB"/>
+                <w:sz w:val="21"/>
+                <w:szCs w:val="21"/>
+              </w:rPr>
+              <w:t xml:space="preserve">MLX implementation, E19 funded (seed 0)</w:t>
             </w:r>
           </w:p>
         </w:tc>
@@ -12580,8 +12578,6 @@
             </w:pPr>
             <w:r>
               <w:rPr>
-                <w:b/>
-                <w:bCs/>
                 <w:lang w:val="en-GB"/>
                 <w:sz w:val="21"/>
                 <w:szCs w:val="21"/>
@@ -12602,8 +12598,6 @@
             </w:pPr>
             <w:r>
               <w:rPr>
-                <w:b/>
-                <w:bCs/>
                 <w:lang w:val="en-GB"/>
                 <w:sz w:val="21"/>
                 <w:szCs w:val="21"/>
@@ -12624,13 +12618,116 @@
             </w:pPr>
             <w:r>
               <w:rPr>
-                <w:b/>
-                <w:bCs/>
                 <w:lang w:val="en-GB"/>
                 <w:sz w:val="21"/>
                 <w:szCs w:val="21"/>
               </w:rPr>
               <w:t xml:space="preserve">40.30%</w:t>
+            </w:r>
+          </w:p>
+        </w:tc>
+      </w:tr>
+      <w:tr>
+        <w:trPr>
+          <w:cantSplit/>
+        </w:trPr>
+        <w:tc>
+          <w:tcPr>
+            <w:tcW w:w="4493" w:type="dxa"/>
+            <w:vAlign w:val="top"/>
+          </w:tcPr>
+          <w:p>
+            <w:pPr>
+              <w:pStyle w:val="Compact"/>
+              <w:spacing w:before="0" w:after="30" w:line="240" w:lineRule="auto"/>
+            </w:pPr>
+            <w:r>
+              <w:rPr>
+                <w:lang w:val="en-GB"/>
+                <w:sz w:val="21"/>
+                <w:szCs w:val="21"/>
+              </w:rPr>
+              <w:t xml:space="preserve">MLX implementation, E20 (seed 1)</w:t>
+            </w:r>
+          </w:p>
+        </w:tc>
+        <w:tc>
+          <w:tcPr>
+            <w:tcW w:w="936" w:type="dxa"/>
+            <w:vAlign w:val="top"/>
+          </w:tcPr>
+          <w:p>
+            <w:pPr>
+              <w:pStyle w:val="Compact"/>
+              <w:spacing w:before="0" w:after="30" w:line="240" w:lineRule="auto"/>
+            </w:pPr>
+            <w:r>
+              <w:rPr>
+                <w:lang w:val="en-GB"/>
+                <w:sz w:val="21"/>
+                <w:szCs w:val="21"/>
+              </w:rPr>
+              <w:t xml:space="preserve">6.4M</w:t>
+            </w:r>
+          </w:p>
+        </w:tc>
+        <w:tc>
+          <w:tcPr>
+            <w:tcW w:w="1310" w:type="dxa"/>
+            <w:vAlign w:val="top"/>
+          </w:tcPr>
+          <w:p>
+            <w:pPr>
+              <w:pStyle w:val="Compact"/>
+              <w:spacing w:before="0" w:after="30" w:line="240" w:lineRule="auto"/>
+            </w:pPr>
+            <w:r>
+              <w:rPr>
+                <w:lang w:val="en-GB"/>
+                <w:sz w:val="21"/>
+                <w:szCs w:val="21"/>
+              </w:rPr>
+              <w:t xml:space="preserve">97.25%</w:t>
+            </w:r>
+          </w:p>
+        </w:tc>
+        <w:tc>
+          <w:tcPr>
+            <w:tcW w:w="1310" w:type="dxa"/>
+            <w:vAlign w:val="top"/>
+          </w:tcPr>
+          <w:p>
+            <w:pPr>
+              <w:pStyle w:val="Compact"/>
+              <w:spacing w:before="0" w:after="30" w:line="240" w:lineRule="auto"/>
+            </w:pPr>
+            <w:r>
+              <w:rPr>
+                <w:lang w:val="en-GB"/>
+                <w:sz w:val="21"/>
+                <w:szCs w:val="21"/>
+              </w:rPr>
+              <w:t xml:space="preserve">79.60%</w:t>
+            </w:r>
+          </w:p>
+        </w:tc>
+        <w:tc>
+          <w:tcPr>
+            <w:tcW w:w="1311" w:type="dxa"/>
+            <w:vAlign w:val="top"/>
+          </w:tcPr>
+          <w:p>
+            <w:pPr>
+              <w:pStyle w:val="Compact"/>
+              <w:spacing w:before="0" w:after="30" w:line="240" w:lineRule="auto"/>
+            </w:pPr>
+            <w:r>
+              <w:rPr>
+                <w:lang w:val="en-GB"/>
+                <w:sz w:val="21"/>
+                <w:szCs w:val="21"/>
+              </w:rPr>
+              <w:t xml:space="preserve">33.25%</w:t>
             </w:r>
           </w:p>
         </w:tc>
@@ -13285,7 +13382,7 @@
         <w:rPr>
           <w:lang w:val="en-GB"/>
         </w:rPr>
-        <w:t xml:space="preserve">The shared E6 codec contains 13,816,704 gradient-trained values, 49,152 EMA-trained codebook values and 49,344 EMA accumulators: 13,915,200 saved scalar values in total. Its learned first-level down/up convolutions account for 10,617,344 trainable values. The 6,440,128 generator values are additional; generator-size comparisons exclude the codec. Older rows preserve historical rounding; E15 and the newly completed runs retain their two-decimal solved rates. Each test set has 2,000 boards. Runs generally use one training seed, and repeated sampling seeds do not quantify training variability.</w:t>
+        <w:t xml:space="preserve">The shared E6 codec contains 13,816,704 gradient-trained values, 49,152 EMA-trained codebook values and 49,344 EMA accumulators: 13,915,200 saved scalar values in total. Its learned first-level down/up convolutions account for 10,617,344 trainable values. The 6,440,128 generator values are additional; generator-size comparisons exclude the codec. Older rows preserve historical rounding; E15 and the newly completed runs retain their two-decimal solved rates. Each test set has 2,000 boards. Most recipes use one training seed; E19-funded and E20 provide two seeds of the same scientific recipe. Repeated sampling seeds do not quantify training variability.</w:t>
       </w:r>
     </w:p>
     <w:p>
@@ -13346,7 +13443,7 @@
         <w:rPr>
           <w:lang w:val="en-GB"/>
         </w:rPr>
-        <w:t xml:space="preserve">Easy-board accuracy is within 1.40 percentage points of Original NCM (98.10% versus 99.50%) with a 6.44M versus 25.46M generator: 3.95× smaller and 3.125× fewer generator presentations. This is a useful small-model result, not overall task parity: medium and hard remain 13.10 and 45.80 points behind. The separate codec is excluded from this size ratio, and the recipes and representation differ.</w:t>
+        <w:t xml:space="preserve">Easy-board accuracy is within 1.40 percentage points of Original NCM (98.10% versus 99.50%) with a 6.44M versus 25.46M generator: 3.95× smaller and 3.125× fewer generator presentations. This is a useful small-model result, not overall task parity: medium and hard remain 13.10 and 45.80 points behind. The separate codec is excluded from this size ratio, and the recipes and representation differ. E20 retains the same generator size and exposure but its easy score is 2.25 points below Original NCM; its medium/hard gaps are 16.90/52.85 points. The best-seed proximity on easy boards is not a reproducibility guarantee.</w:t>
       </w:r>
     </w:p>
     <w:p>
@@ -13928,7 +14025,818 @@
         <w:rPr>
           <w:lang w:val="en-GB"/>
         </w:rPr>
-        <w:t xml:space="preserve">Funded validation solves 70.90% of 1,000 boards. On easy/medium/hard tests, blank-cell accuracy is 99.69 / 97.12 / 86.99% and givens preservation is 100 / 100 / 99.60%; full-depth codec validation reconstruction is separately 100%. Wilson 95% intervals for the solved rates are 97.40–98.61 / 81.71–84.97 / 38.17–42.47%. These assume independent test boards, exclude training-seed variability and do not establish paired significance against prior runs. Per-board prediction archives were not retained. A second training seed is the next validation step.</w:t>
+        <w:t xml:space="preserve">Funded validation solves 70.90% of 1,000 boards. On easy/medium/hard tests, blank-cell accuracy is 99.69 / 97.12 / 86.99% and givens preservation is 100 / 100 / 99.60%; full-depth codec validation reconstruction is separately 100%. Wilson 95% intervals for the solved rates are 97.40–98.61 / 81.71–84.97 / 38.17–42.47%. These assume independent test boards, exclude training-seed variability and do not establish paired significance against prior runs. Per-board prediction archives were not retained. E20 supplies a second training seed below.</w:t>
+      </w:r>
+    </w:p>
+    <w:p>
+      <w:pPr>
+        <w:pStyle w:val="Heading3"/>
+      </w:pPr>
+      <w:bookmarkStart w:id="38" w:name="_1e965c8b0182d757e08ddd2b2df590a3994b2e4"/>
+      <w:r>
+        <w:rPr>
+          <w:rStyle w:val="SectionNumber"/>
+          <w:lang w:val="en-GB"/>
+        </w:rPr>
+        <w:t xml:space="preserve">7.2.2</w:t>
+      </w:r>
+      <w:r>
+        <w:tab/>
+      </w:r>
+      <w:r>
+        <w:rPr>
+          <w:lang w:val="en-GB"/>
+        </w:rPr>
+        <w:t xml:space="preserve">E20: a second training seed</w:t>
+      </w:r>
+      <w:bookmarkEnd w:id="38"/>
+    </w:p>
+    <w:p>
+      <w:pPr>
+        <w:pStyle w:val="FirstParagraph"/>
+      </w:pPr>
+      <w:r>
+        <w:rPr>
+          <w:lang w:val="en-GB"/>
+        </w:rPr>
+        <w:t xml:space="preserve">E20 repeats the E19-funded scientific recipe with configured training seed 1 instead of 0. Both complete 128,000 updates at batch 128, using the frozen E6 codec, 200,000 base puzzles plus 8M cached unique puzzles, corruption 0.50→0.10, learning rate 0.0006 and 1,000-step warmup. Shared codec and corpus input-manifest hashes match. The configured seed affects initialization, minibatch order, dropout and corruption; internal generator streams use that seed plus one. These influences are not separately controlled.</w:t>
+      </w:r>
+    </w:p>
+    <w:p>
+      <w:pPr>
+        <w:pStyle w:val="BodyText"/>
+      </w:pPr>
+      <w:r>
+        <w:rPr>
+          <w:lang w:val="en-GB"/>
+        </w:rPr>
+        <w:t xml:space="preserve">The run name, output path and operational cap also change. E20’s cap is 960 rather than 1,440 minutes; neither run reaches its cap. E20 records no optimizer reset or truncation, and its final full-state snapshot and selected best checkpoint are both step 128,000. Training-loop time is 54,122.43 s; pipeline time is 55,543.62 s under the E19 timing boundary. Best weighted code CE is 0.142558, compared with 0.133244 for seed 0. Separate physical A40 allocations and missing remote source inventories prevent a strict same-host causal attribution.</w:t>
+      </w:r>
+    </w:p>
+    <w:p>
+      <w:pPr>
+        <w:pStyle w:val="TableCaption"/>
+      </w:pPr>
+      <w:r>
+        <w:rPr>
+          <w:lang w:val="en-GB"/>
+        </w:rPr>
+        <w:t xml:space="preserve">Two-seed held-out aggregates. Each seed reports the same 2,000-board benchmark per difficulty; the mean is descriptive, not a pooled independent sample.</w:t>
+      </w:r>
+    </w:p>
+    <w:tbl>
+      <w:tblPr>
+        <w:tblStyle w:val="Table"/>
+        <w:tblW w:type="dxa" w:w="9360"/>
+        <w:tblLayout w:type="fixed"/>
+        <w:tblLook w:firstRow="1" w:lastRow="0" w:firstColumn="0" w:lastColumn="0" w:noHBand="0" w:noVBand="0" w:val="0020"/>
+        <w:tblCaption w:val="Two-seed held-out aggregates. Each seed reports the same 2,000-board benchmark per difficulty; the mean is descriptive, not a pooled independent sample."/>
+        <w:tblInd w:w="0" w:type="dxa"/>
+        <w:tblCellMar>
+          <w:left w:w="100" w:type="dxa"/>
+          <w:right w:w="100" w:type="dxa"/>
+          <w:top w:w="65" w:type="dxa"/>
+          <w:bottom w:w="65" w:type="dxa"/>
+        </w:tblCellMar>
+      </w:tblPr>
+      <w:tblGrid>
+        <w:gridCol w:w="2340"/>
+        <w:gridCol w:w="2340"/>
+        <w:gridCol w:w="2340"/>
+        <w:gridCol w:w="2340"/>
+      </w:tblGrid>
+      <w:tr>
+        <w:trPr>
+          <w:tblHeader w:val="on"/>
+          <w:cantSplit/>
+        </w:trPr>
+        <w:tc>
+          <w:tcPr>
+            <w:tcW w:w="2340" w:type="dxa"/>
+            <w:vAlign w:val="top"/>
+            <w:tcBorders>
+              <w:bottom w:val="single" w:sz="6" w:color="8C9DA5"/>
+            </w:tcBorders>
+          </w:tcPr>
+          <w:p>
+            <w:pPr>
+              <w:pStyle w:val="Compact"/>
+              <w:spacing w:before="0" w:after="30" w:line="240" w:lineRule="auto"/>
+              <w:keepNext/>
+            </w:pPr>
+            <w:r>
+              <w:rPr>
+                <w:lang w:val="en-GB"/>
+                <w:sz w:val="21"/>
+                <w:szCs w:val="21"/>
+                <w:b/>
+              </w:rPr>
+              <w:t xml:space="preserve">Quantity</w:t>
+            </w:r>
+          </w:p>
+        </w:tc>
+        <w:tc>
+          <w:tcPr>
+            <w:tcW w:w="2340" w:type="dxa"/>
+            <w:vAlign w:val="top"/>
+            <w:tcBorders>
+              <w:bottom w:val="single" w:sz="6" w:color="8C9DA5"/>
+            </w:tcBorders>
+          </w:tcPr>
+          <w:p>
+            <w:pPr>
+              <w:pStyle w:val="Compact"/>
+              <w:jc w:val="right"/>
+              <w:spacing w:before="0" w:after="30" w:line="240" w:lineRule="auto"/>
+              <w:keepNext/>
+            </w:pPr>
+            <w:r>
+              <w:rPr>
+                <w:lang w:val="en-GB"/>
+                <w:sz w:val="21"/>
+                <w:szCs w:val="21"/>
+                <w:b/>
+              </w:rPr>
+              <w:t xml:space="preserve">Easy</w:t>
+            </w:r>
+          </w:p>
+        </w:tc>
+        <w:tc>
+          <w:tcPr>
+            <w:tcW w:w="2340" w:type="dxa"/>
+            <w:vAlign w:val="top"/>
+            <w:tcBorders>
+              <w:bottom w:val="single" w:sz="6" w:color="8C9DA5"/>
+            </w:tcBorders>
+          </w:tcPr>
+          <w:p>
+            <w:pPr>
+              <w:pStyle w:val="Compact"/>
+              <w:jc w:val="right"/>
+              <w:spacing w:before="0" w:after="30" w:line="240" w:lineRule="auto"/>
+              <w:keepNext/>
+            </w:pPr>
+            <w:r>
+              <w:rPr>
+                <w:lang w:val="en-GB"/>
+                <w:sz w:val="21"/>
+                <w:szCs w:val="21"/>
+                <w:b/>
+              </w:rPr>
+              <w:t xml:space="preserve">Medium</w:t>
+            </w:r>
+          </w:p>
+        </w:tc>
+        <w:tc>
+          <w:tcPr>
+            <w:tcW w:w="2340" w:type="dxa"/>
+            <w:vAlign w:val="top"/>
+            <w:tcBorders>
+              <w:bottom w:val="single" w:sz="6" w:color="8C9DA5"/>
+            </w:tcBorders>
+          </w:tcPr>
+          <w:p>
+            <w:pPr>
+              <w:pStyle w:val="Compact"/>
+              <w:jc w:val="right"/>
+              <w:spacing w:before="0" w:after="30" w:line="240" w:lineRule="auto"/>
+              <w:keepNext/>
+            </w:pPr>
+            <w:r>
+              <w:rPr>
+                <w:lang w:val="en-GB"/>
+                <w:sz w:val="21"/>
+                <w:szCs w:val="21"/>
+                <w:b/>
+              </w:rPr>
+              <w:t xml:space="preserve">Hard</w:t>
+            </w:r>
+          </w:p>
+        </w:tc>
+      </w:tr>
+      <w:tr>
+        <w:trPr>
+          <w:cantSplit/>
+        </w:trPr>
+        <w:tc>
+          <w:tcPr>
+            <w:tcW w:w="2340" w:type="dxa"/>
+            <w:vAlign w:val="top"/>
+          </w:tcPr>
+          <w:p>
+            <w:pPr>
+              <w:pStyle w:val="Compact"/>
+              <w:spacing w:before="0" w:after="30" w:line="240" w:lineRule="auto"/>
+            </w:pPr>
+            <w:r>
+              <w:rPr>
+                <w:lang w:val="en-GB"/>
+                <w:sz w:val="21"/>
+                <w:szCs w:val="21"/>
+              </w:rPr>
+              <w:t xml:space="preserve">Seed 0 solved boards</w:t>
+            </w:r>
+          </w:p>
+        </w:tc>
+        <w:tc>
+          <w:tcPr>
+            <w:tcW w:w="2340" w:type="dxa"/>
+            <w:vAlign w:val="top"/>
+          </w:tcPr>
+          <w:p>
+            <w:pPr>
+              <w:pStyle w:val="Compact"/>
+              <w:jc w:val="right"/>
+              <w:spacing w:before="0" w:after="30" w:line="240" w:lineRule="auto"/>
+            </w:pPr>
+            <w:r>
+              <w:rPr>
+                <w:lang w:val="en-GB"/>
+                <w:sz w:val="21"/>
+                <w:szCs w:val="21"/>
+              </w:rPr>
+              <w:t xml:space="preserve">1,962</w:t>
+            </w:r>
+          </w:p>
+        </w:tc>
+        <w:tc>
+          <w:tcPr>
+            <w:tcW w:w="2340" w:type="dxa"/>
+            <w:vAlign w:val="top"/>
+          </w:tcPr>
+          <w:p>
+            <w:pPr>
+              <w:pStyle w:val="Compact"/>
+              <w:jc w:val="right"/>
+              <w:spacing w:before="0" w:after="30" w:line="240" w:lineRule="auto"/>
+            </w:pPr>
+            <w:r>
+              <w:rPr>
+                <w:lang w:val="en-GB"/>
+                <w:sz w:val="21"/>
+                <w:szCs w:val="21"/>
+              </w:rPr>
+              <w:t xml:space="preserve">1,668</w:t>
+            </w:r>
+          </w:p>
+        </w:tc>
+        <w:tc>
+          <w:tcPr>
+            <w:tcW w:w="2340" w:type="dxa"/>
+            <w:vAlign w:val="top"/>
+          </w:tcPr>
+          <w:p>
+            <w:pPr>
+              <w:pStyle w:val="Compact"/>
+              <w:jc w:val="right"/>
+              <w:spacing w:before="0" w:after="30" w:line="240" w:lineRule="auto"/>
+            </w:pPr>
+            <w:r>
+              <w:rPr>
+                <w:lang w:val="en-GB"/>
+                <w:sz w:val="21"/>
+                <w:szCs w:val="21"/>
+              </w:rPr>
+              <w:t xml:space="preserve">806</w:t>
+            </w:r>
+          </w:p>
+        </w:tc>
+      </w:tr>
+      <w:tr>
+        <w:trPr>
+          <w:cantSplit/>
+        </w:trPr>
+        <w:tc>
+          <w:tcPr>
+            <w:tcW w:w="2340" w:type="dxa"/>
+            <w:vAlign w:val="top"/>
+          </w:tcPr>
+          <w:p>
+            <w:pPr>
+              <w:pStyle w:val="Compact"/>
+              <w:spacing w:before="0" w:after="30" w:line="240" w:lineRule="auto"/>
+            </w:pPr>
+            <w:r>
+              <w:rPr>
+                <w:lang w:val="en-GB"/>
+                <w:sz w:val="21"/>
+                <w:szCs w:val="21"/>
+              </w:rPr>
+              <w:t xml:space="preserve">Seed 1 solved boards</w:t>
+            </w:r>
+          </w:p>
+        </w:tc>
+        <w:tc>
+          <w:tcPr>
+            <w:tcW w:w="2340" w:type="dxa"/>
+            <w:vAlign w:val="top"/>
+          </w:tcPr>
+          <w:p>
+            <w:pPr>
+              <w:pStyle w:val="Compact"/>
+              <w:jc w:val="right"/>
+              <w:spacing w:before="0" w:after="30" w:line="240" w:lineRule="auto"/>
+            </w:pPr>
+            <w:r>
+              <w:rPr>
+                <w:lang w:val="en-GB"/>
+                <w:sz w:val="21"/>
+                <w:szCs w:val="21"/>
+              </w:rPr>
+              <w:t xml:space="preserve">1,945</w:t>
+            </w:r>
+          </w:p>
+        </w:tc>
+        <w:tc>
+          <w:tcPr>
+            <w:tcW w:w="2340" w:type="dxa"/>
+            <w:vAlign w:val="top"/>
+          </w:tcPr>
+          <w:p>
+            <w:pPr>
+              <w:pStyle w:val="Compact"/>
+              <w:jc w:val="right"/>
+              <w:spacing w:before="0" w:after="30" w:line="240" w:lineRule="auto"/>
+            </w:pPr>
+            <w:r>
+              <w:rPr>
+                <w:lang w:val="en-GB"/>
+                <w:sz w:val="21"/>
+                <w:szCs w:val="21"/>
+              </w:rPr>
+              <w:t xml:space="preserve">1,592</w:t>
+            </w:r>
+          </w:p>
+        </w:tc>
+        <w:tc>
+          <w:tcPr>
+            <w:tcW w:w="2340" w:type="dxa"/>
+            <w:vAlign w:val="top"/>
+          </w:tcPr>
+          <w:p>
+            <w:pPr>
+              <w:pStyle w:val="Compact"/>
+              <w:jc w:val="right"/>
+              <w:spacing w:before="0" w:after="30" w:line="240" w:lineRule="auto"/>
+            </w:pPr>
+            <w:r>
+              <w:rPr>
+                <w:lang w:val="en-GB"/>
+                <w:sz w:val="21"/>
+                <w:szCs w:val="21"/>
+              </w:rPr>
+              <w:t xml:space="preserve">665</w:t>
+            </w:r>
+          </w:p>
+        </w:tc>
+      </w:tr>
+      <w:tr>
+        <w:trPr>
+          <w:cantSplit/>
+        </w:trPr>
+        <w:tc>
+          <w:tcPr>
+            <w:tcW w:w="2340" w:type="dxa"/>
+            <w:vAlign w:val="top"/>
+          </w:tcPr>
+          <w:p>
+            <w:pPr>
+              <w:pStyle w:val="Compact"/>
+              <w:spacing w:before="0" w:after="30" w:line="240" w:lineRule="auto"/>
+            </w:pPr>
+            <w:r>
+              <w:rPr>
+                <w:lang w:val="en-GB"/>
+                <w:sz w:val="21"/>
+                <w:szCs w:val="21"/>
+              </w:rPr>
+              <w:t xml:space="preserve">Seed 1 solved rate</w:t>
+            </w:r>
+          </w:p>
+        </w:tc>
+        <w:tc>
+          <w:tcPr>
+            <w:tcW w:w="2340" w:type="dxa"/>
+            <w:vAlign w:val="top"/>
+          </w:tcPr>
+          <w:p>
+            <w:pPr>
+              <w:pStyle w:val="Compact"/>
+              <w:jc w:val="right"/>
+              <w:spacing w:before="0" w:after="30" w:line="240" w:lineRule="auto"/>
+            </w:pPr>
+            <w:r>
+              <w:rPr>
+                <w:lang w:val="en-GB"/>
+                <w:sz w:val="21"/>
+                <w:szCs w:val="21"/>
+              </w:rPr>
+              <w:t xml:space="preserve">97.25%</w:t>
+            </w:r>
+          </w:p>
+        </w:tc>
+        <w:tc>
+          <w:tcPr>
+            <w:tcW w:w="2340" w:type="dxa"/>
+            <w:vAlign w:val="top"/>
+          </w:tcPr>
+          <w:p>
+            <w:pPr>
+              <w:pStyle w:val="Compact"/>
+              <w:jc w:val="right"/>
+              <w:spacing w:before="0" w:after="30" w:line="240" w:lineRule="auto"/>
+            </w:pPr>
+            <w:r>
+              <w:rPr>
+                <w:lang w:val="en-GB"/>
+                <w:sz w:val="21"/>
+                <w:szCs w:val="21"/>
+              </w:rPr>
+              <w:t xml:space="preserve">79.60%</w:t>
+            </w:r>
+          </w:p>
+        </w:tc>
+        <w:tc>
+          <w:tcPr>
+            <w:tcW w:w="2340" w:type="dxa"/>
+            <w:vAlign w:val="top"/>
+          </w:tcPr>
+          <w:p>
+            <w:pPr>
+              <w:pStyle w:val="Compact"/>
+              <w:jc w:val="right"/>
+              <w:spacing w:before="0" w:after="30" w:line="240" w:lineRule="auto"/>
+            </w:pPr>
+            <w:r>
+              <w:rPr>
+                <w:lang w:val="en-GB"/>
+                <w:sz w:val="21"/>
+                <w:szCs w:val="21"/>
+              </w:rPr>
+              <w:t xml:space="preserve">33.25%</w:t>
+            </w:r>
+          </w:p>
+        </w:tc>
+      </w:tr>
+      <w:tr>
+        <w:trPr>
+          <w:cantSplit/>
+        </w:trPr>
+        <w:tc>
+          <w:tcPr>
+            <w:tcW w:w="2340" w:type="dxa"/>
+            <w:vAlign w:val="top"/>
+          </w:tcPr>
+          <w:p>
+            <w:pPr>
+              <w:pStyle w:val="Compact"/>
+              <w:spacing w:before="0" w:after="30" w:line="240" w:lineRule="auto"/>
+            </w:pPr>
+            <w:r>
+              <w:rPr>
+                <w:lang w:val="en-GB"/>
+                <w:sz w:val="21"/>
+                <w:szCs w:val="21"/>
+              </w:rPr>
+              <w:t xml:space="preserve">Seed 1 minus seed 0</w:t>
+            </w:r>
+          </w:p>
+        </w:tc>
+        <w:tc>
+          <w:tcPr>
+            <w:tcW w:w="2340" w:type="dxa"/>
+            <w:vAlign w:val="top"/>
+          </w:tcPr>
+          <w:p>
+            <w:pPr>
+              <w:pStyle w:val="Compact"/>
+              <w:jc w:val="right"/>
+              <w:spacing w:before="0" w:after="30" w:line="240" w:lineRule="auto"/>
+            </w:pPr>
+            <w:r>
+              <w:rPr>
+                <w:lang w:val="en-GB"/>
+                <w:sz w:val="21"/>
+                <w:szCs w:val="21"/>
+              </w:rPr>
+              <w:t xml:space="preserve">−0.85 pp</w:t>
+            </w:r>
+          </w:p>
+        </w:tc>
+        <w:tc>
+          <w:tcPr>
+            <w:tcW w:w="2340" w:type="dxa"/>
+            <w:vAlign w:val="top"/>
+          </w:tcPr>
+          <w:p>
+            <w:pPr>
+              <w:pStyle w:val="Compact"/>
+              <w:jc w:val="right"/>
+              <w:spacing w:before="0" w:after="30" w:line="240" w:lineRule="auto"/>
+            </w:pPr>
+            <w:r>
+              <w:rPr>
+                <w:lang w:val="en-GB"/>
+                <w:sz w:val="21"/>
+                <w:szCs w:val="21"/>
+              </w:rPr>
+              <w:t xml:space="preserve">−3.80 pp</w:t>
+            </w:r>
+          </w:p>
+        </w:tc>
+        <w:tc>
+          <w:tcPr>
+            <w:tcW w:w="2340" w:type="dxa"/>
+            <w:vAlign w:val="top"/>
+          </w:tcPr>
+          <w:p>
+            <w:pPr>
+              <w:pStyle w:val="Compact"/>
+              <w:jc w:val="right"/>
+              <w:spacing w:before="0" w:after="30" w:line="240" w:lineRule="auto"/>
+            </w:pPr>
+            <w:r>
+              <w:rPr>
+                <w:lang w:val="en-GB"/>
+                <w:sz w:val="21"/>
+                <w:szCs w:val="21"/>
+              </w:rPr>
+              <w:t xml:space="preserve">−7.05 pp</w:t>
+            </w:r>
+          </w:p>
+        </w:tc>
+      </w:tr>
+      <w:tr>
+        <w:trPr>
+          <w:cantSplit/>
+        </w:trPr>
+        <w:tc>
+          <w:tcPr>
+            <w:tcW w:w="2340" w:type="dxa"/>
+            <w:vAlign w:val="top"/>
+          </w:tcPr>
+          <w:p>
+            <w:pPr>
+              <w:pStyle w:val="Compact"/>
+              <w:spacing w:before="0" w:after="30" w:line="240" w:lineRule="auto"/>
+            </w:pPr>
+            <w:r>
+              <w:rPr>
+                <w:lang w:val="en-GB"/>
+                <w:sz w:val="21"/>
+                <w:szCs w:val="21"/>
+              </w:rPr>
+              <w:t xml:space="preserve">Two-seed mean</w:t>
+            </w:r>
+          </w:p>
+        </w:tc>
+        <w:tc>
+          <w:tcPr>
+            <w:tcW w:w="2340" w:type="dxa"/>
+            <w:vAlign w:val="top"/>
+          </w:tcPr>
+          <w:p>
+            <w:pPr>
+              <w:pStyle w:val="Compact"/>
+              <w:jc w:val="right"/>
+              <w:spacing w:before="0" w:after="30" w:line="240" w:lineRule="auto"/>
+            </w:pPr>
+            <w:r>
+              <w:rPr>
+                <w:lang w:val="en-GB"/>
+                <w:sz w:val="21"/>
+                <w:szCs w:val="21"/>
+              </w:rPr>
+              <w:t xml:space="preserve">97.675%</w:t>
+            </w:r>
+          </w:p>
+        </w:tc>
+        <w:tc>
+          <w:tcPr>
+            <w:tcW w:w="2340" w:type="dxa"/>
+            <w:vAlign w:val="top"/>
+          </w:tcPr>
+          <w:p>
+            <w:pPr>
+              <w:pStyle w:val="Compact"/>
+              <w:jc w:val="right"/>
+              <w:spacing w:before="0" w:after="30" w:line="240" w:lineRule="auto"/>
+            </w:pPr>
+            <w:r>
+              <w:rPr>
+                <w:lang w:val="en-GB"/>
+                <w:sz w:val="21"/>
+                <w:szCs w:val="21"/>
+              </w:rPr>
+              <w:t xml:space="preserve">81.500%</w:t>
+            </w:r>
+          </w:p>
+        </w:tc>
+        <w:tc>
+          <w:tcPr>
+            <w:tcW w:w="2340" w:type="dxa"/>
+            <w:vAlign w:val="top"/>
+          </w:tcPr>
+          <w:p>
+            <w:pPr>
+              <w:pStyle w:val="Compact"/>
+              <w:jc w:val="right"/>
+              <w:spacing w:before="0" w:after="30" w:line="240" w:lineRule="auto"/>
+            </w:pPr>
+            <w:r>
+              <w:rPr>
+                <w:lang w:val="en-GB"/>
+                <w:sz w:val="21"/>
+                <w:szCs w:val="21"/>
+              </w:rPr>
+              <w:t xml:space="preserve">36.775%</w:t>
+            </w:r>
+          </w:p>
+        </w:tc>
+      </w:tr>
+      <w:tr>
+        <w:trPr>
+          <w:cantSplit/>
+        </w:trPr>
+        <w:tc>
+          <w:tcPr>
+            <w:tcW w:w="2340" w:type="dxa"/>
+            <w:vAlign w:val="top"/>
+          </w:tcPr>
+          <w:p>
+            <w:pPr>
+              <w:pStyle w:val="Compact"/>
+              <w:spacing w:before="0" w:after="30" w:line="240" w:lineRule="auto"/>
+            </w:pPr>
+            <w:r>
+              <w:rPr>
+                <w:lang w:val="en-GB"/>
+                <w:sz w:val="21"/>
+                <w:szCs w:val="21"/>
+              </w:rPr>
+              <w:t xml:space="preserve">Seed 1 Wilson 95% interval</w:t>
+            </w:r>
+          </w:p>
+        </w:tc>
+        <w:tc>
+          <w:tcPr>
+            <w:tcW w:w="2340" w:type="dxa"/>
+            <w:vAlign w:val="top"/>
+          </w:tcPr>
+          <w:p>
+            <w:pPr>
+              <w:pStyle w:val="Compact"/>
+              <w:jc w:val="right"/>
+              <w:spacing w:before="0" w:after="30" w:line="240" w:lineRule="auto"/>
+            </w:pPr>
+            <w:r>
+              <w:rPr>
+                <w:lang w:val="en-GB"/>
+                <w:sz w:val="21"/>
+                <w:szCs w:val="21"/>
+              </w:rPr>
+              <w:t xml:space="preserve">96.44–97.88%</w:t>
+            </w:r>
+          </w:p>
+        </w:tc>
+        <w:tc>
+          <w:tcPr>
+            <w:tcW w:w="2340" w:type="dxa"/>
+            <w:vAlign w:val="top"/>
+          </w:tcPr>
+          <w:p>
+            <w:pPr>
+              <w:pStyle w:val="Compact"/>
+              <w:jc w:val="right"/>
+              <w:spacing w:before="0" w:after="30" w:line="240" w:lineRule="auto"/>
+            </w:pPr>
+            <w:r>
+              <w:rPr>
+                <w:lang w:val="en-GB"/>
+                <w:sz w:val="21"/>
+                <w:szCs w:val="21"/>
+              </w:rPr>
+              <w:t xml:space="preserve">77.78–81.31%</w:t>
+            </w:r>
+          </w:p>
+        </w:tc>
+        <w:tc>
+          <w:tcPr>
+            <w:tcW w:w="2340" w:type="dxa"/>
+            <w:vAlign w:val="top"/>
+          </w:tcPr>
+          <w:p>
+            <w:pPr>
+              <w:pStyle w:val="Compact"/>
+              <w:jc w:val="right"/>
+              <w:spacing w:before="0" w:after="30" w:line="240" w:lineRule="auto"/>
+            </w:pPr>
+            <w:r>
+              <w:rPr>
+                <w:lang w:val="en-GB"/>
+                <w:sz w:val="21"/>
+                <w:szCs w:val="21"/>
+              </w:rPr>
+              <w:t xml:space="preserve">31.22–35.35%</w:t>
+            </w:r>
+          </w:p>
+        </w:tc>
+      </w:tr>
+    </w:tbl>
+    <w:p>
+      <w:pPr>
+        <w:pStyle w:val="FirstParagraph"/>
+      </w:pPr>
+      <w:r>
+        <w:rPr>
+          <w:lang w:val="en-GB"/>
+        </w:rPr>
+        <w:t xml:space="preserve">Both seeds retain strong easy-board performance and substantially weaker hard performance. E19-funded remains the best observed seed; neither two-seed means nor board-level Wilson intervals reliably estimate the population distribution of training outcomes. The intervals also exclude related-board dependence and repeated benchmark-guided recipe selection. Without per-board predictions, paired significance and agreement between the solved-board sets cannot be computed. No additional model evaluation is included in this version.</w:t>
+      </w:r>
+    </w:p>
+    <w:p>
+      <w:pPr>
+        <w:pStyle w:val="BodyText"/>
+      </w:pPr>
+      <w:r>
+        <w:rPr>
+          <w:lang w:val="en-GB"/>
+        </w:rPr>
+        <w:t xml:space="preserve">E20 validation solves 71.00%, compared with 70.90% for E19-funded, while hard blank-cell accuracy falls from 86.99% to 84.92%. Similar validation solving therefore does not imply similar external hard-set performance. The saved hard aggregates identify 670 valid grids, of which 665 preserve the givens: 1,330 failures are invalid grids and five additional failures are valid grids contradicting clues. Fourteen boards violate givens overall. Clue preservation alone cannot repair the dominant invalid-grid failure; the aggregates do not identify its internal cause.</w:t>
+      </w:r>
+    </w:p>
+    <w:p>
+      <w:pPr>
+        <w:pStyle w:val="BodyText"/>
+      </w:pPr>
+      <w:r>
+        <w:rPr>
+          <w:b/>
+          <w:bCs/>
+          <w:lang w:val="en-GB"/>
+        </w:rPr>
+        <w:t xml:space="preserve">Audit boundary.</w:t>
+      </w:r>
+      <w:r>
+        <w:rPr>
+          <w:lang w:val="en-GB"/>
+        </w:rPr>
+        <w:t xml:space="preserve"> </w:t>
+      </w:r>
+      <w:r>
+        <w:rPr>
+          <w:lang w:val="en-GB"/>
+        </w:rPr>
+        <w:t xml:space="preserve">All 15 retained E20 completion files match recorded hashes; inference tensors equal the saved best-model tensors, and optimizer/training steps agree at 128,000. Generator SHA-256 is</w:t>
+      </w:r>
+      <w:r>
+        <w:rPr>
+          <w:lang w:val="en-GB"/>
+        </w:rPr>
+        <w:t xml:space="preserve"> </w:t>
+      </w:r>
+      <w:r>
+        <w:rPr>
+          <w:rStyle w:val="VerbatimChar"/>
+          <w:lang w:val="en-GB"/>
+        </w:rPr>
+        <w:t xml:space="preserve">b6ddadb7278e7f1c5542eecef676840f39cb829e802d189b65f2dadd645c2b3d</w:t>
+      </w:r>
+      <w:r>
+        <w:rPr>
+          <w:lang w:val="en-GB"/>
+        </w:rPr>
+        <w:t xml:space="preserve">; the declared source is</w:t>
+      </w:r>
+      <w:r>
+        <w:rPr>
+          <w:lang w:val="en-GB"/>
+        </w:rPr>
+        <w:t xml:space="preserve"> </w:t>
+      </w:r>
+      <w:r>
+        <w:rPr>
+          <w:rStyle w:val="VerbatimChar"/>
+          <w:lang w:val="en-GB"/>
+        </w:rPr>
+        <w:t xml:space="preserve">4ad3646189197fe1ca76e45308848793fefe9a3f</w:t>
+      </w:r>
+      <w:r>
+        <w:rPr>
+          <w:lang w:val="en-GB"/>
+        </w:rPr>
+        <w:t xml:space="preserve">. These checks establish retained-byte integrity and internal consistency, not independent reproduction. No checkpoint-bound ordered scoring manifest, per-board predictions or remote source digest inventory was retained. Current local board files match the published hashes, but they were absent from the remote transfer-verification manifest. Actual remote evaluation identity, complete duplicate-free coverage and exact source bytes remain independently unverified. Reported outcomes are historical aggregates with these limits.</w:t>
+      </w:r>
+    </w:p>
+    <w:p>
+      <w:pPr>
+        <w:pStyle w:val="BodyText"/>
+      </w:pPr>
+      <w:r>
+        <w:rPr>
+          <w:lang w:val="en-GB"/>
+        </w:rPr>
+        <w:t xml:space="preserve">E20’s recorded synchronized benchmark uses temperature 1, three warmups and 20 iterations. Batch 1/16/64/256 p50 is 29.453/48.506/174.326/581.791 ms; p95 is 30.323/49.274/175.352/583.397 ms. The CUDA GPU-load log is empty because the wrapper used a Metal-only probe. Contention at benchmark time is unknown, and these timings neither measure greedy quality generation nor establish a seed-dependent speed effect.</w:t>
       </w:r>
     </w:p>
     <w:p>
@@ -13940,18 +14848,18 @@
           <ns1:inline>
             <ns1:extent cx="5334000" cy="2333625"/>
             <ns1:effectExtent b="0" l="0" r="0" t="0"/>
-            <ns1:docPr descr="Completed MLX implementation recipes, with actual generator presentations beneath each run. Each bar uses 2,000 held-out boards. Dashed lines show Original NCM (Kumbong et al.), with its larger generator and 51.2M presentations; they are not matched-budget targets." title="" id="39" name="Picture"/>
+            <ns1:docPr descr="Completed MLX implementation recipes, with rounded generator presentations beneath each run; exact exposures are in the tables. Each bar reports 2,000 held-out boards; retained aggregate and provenance limitations apply. Dashed lines show Original NCM (Kumbong et al.), with its larger generator and 51.2M presentations; they are not matched-budget targets." title="" id="40" name="Picture"/>
             <ns2:graphic>
               <ns2:graphicData uri="http://schemas.openxmlformats.org/drawingml/2006/picture">
                 <ns3:pic>
                   <ns3:nvPicPr>
-                    <ns3:cNvPr descr="figures/sudoku-completed-runs.png" id="40" name="Picture"/>
+                    <ns3:cNvPr descr="figures/sudoku-completed-runs.png" id="41" name="Picture"/>
                     <ns3:cNvPicPr>
                       <ns2:picLocks noChangeArrowheads="1" noChangeAspect="1"/>
                     </ns3:cNvPicPr>
                   </ns3:nvPicPr>
                   <ns3:blipFill>
-                    <ns2:blip ns4:embed="rId38"/>
+                    <ns2:blip ns4:embed="rId39"/>
                     <ns2:stretch>
                       <ns2:fillRect/>
                     </ns2:stretch>
@@ -13986,7 +14894,7 @@
         <w:rPr>
           <w:lang w:val="en-GB"/>
         </w:rPr>
-        <w:t xml:space="preserve">Completed MLX implementation recipes, with actual generator presentations beneath each run. Each bar uses 2,000 held-out boards. Dashed lines show Original NCM (Kumbong et al.), with its larger generator and 51.2M presentations; they are not matched-budget targets.</w:t>
+        <w:t xml:space="preserve">Completed MLX implementation recipes, with rounded generator presentations beneath each run; exact exposures are in the tables. Each bar reports 2,000 held-out boards; retained aggregate and provenance limitations apply. Dashed lines show Original NCM (Kumbong et al.), with its larger generator and 51.2M presentations; they are not matched-budget targets.</w:t>
       </w:r>
     </w:p>
     <w:p>
@@ -14039,18 +14947,18 @@
           <ns1:inline>
             <ns1:extent cx="3307079" cy="2204720"/>
             <ns1:effectExtent b="0" l="0" r="0" t="0"/>
-            <ns1:docPr descr="Cell accuracy when decoding from the first k levels of the codec, against the share of codes used. E4 stores almost all information in one level; E5 and E6 refine gradually." title="" id="42" name="Picture"/>
+            <ns1:docPr descr="Cell accuracy when decoding from the first k levels of the codec, against the share of codes used. E4 stores almost all information in one level; E5 and E6 refine gradually." title="" id="43" name="Picture"/>
             <ns2:graphic>
               <ns2:graphicData uri="http://schemas.openxmlformats.org/drawingml/2006/picture">
                 <ns3:pic>
                   <ns3:nvPicPr>
-                    <ns3:cNvPr descr="figures/codec-refinement.png" id="43" name="Picture"/>
+                    <ns3:cNvPr descr="figures/codec-refinement.png" id="44" name="Picture"/>
                     <ns3:cNvPicPr>
                       <ns2:picLocks noChangeArrowheads="1" noChangeAspect="1"/>
                     </ns3:cNvPicPr>
                   </ns3:nvPicPr>
                   <ns3:blipFill>
-                    <ns2:blip ns4:embed="rId41"/>
+                    <ns2:blip ns4:embed="rId42"/>
                     <ns2:stretch>
                       <ns2:fillRect/>
                     </ns2:stretch>
@@ -14120,18 +15028,18 @@
           <ns1:inline>
             <ns1:extent cx="3307079" cy="2204720"/>
             <ns1:effectExtent b="0" l="0" r="0" t="0"/>
-            <ns1:docPr descr="Validation cross-entropy per code during generator training." title="" id="45" name="Picture"/>
+            <ns1:docPr descr="Validation cross-entropy per code during generator training." title="" id="46" name="Picture"/>
             <ns2:graphic>
               <ns2:graphicData uri="http://schemas.openxmlformats.org/drawingml/2006/picture">
                 <ns3:pic>
                   <ns3:nvPicPr>
-                    <ns3:cNvPr descr="figures/sudoku-val-curves.png" id="46" name="Picture"/>
+                    <ns3:cNvPr descr="figures/sudoku-val-curves.png" id="47" name="Picture"/>
                     <ns3:cNvPicPr>
                       <ns2:picLocks noChangeArrowheads="1" noChangeAspect="1"/>
                     </ns3:cNvPicPr>
                   </ns3:nvPicPr>
                   <ns3:blipFill>
-                    <ns2:blip ns4:embed="rId44"/>
+                    <ns2:blip ns4:embed="rId45"/>
                     <ns2:stretch>
                       <ns2:fillRect/>
                     </ns2:stretch>
@@ -14178,18 +15086,18 @@
           <ns1:inline>
             <ns1:extent cx="5334000" cy="2166937"/>
             <ns1:effectExtent b="0" l="0" r="0" t="0"/>
-            <ns1:docPr descr="Blank cells filled with the reference digit, per test set. Chance is about 11%." title="" id="48" name="Picture"/>
+            <ns1:docPr descr="Blank cells filled with the reference digit, per test set. Chance is about 11%." title="" id="49" name="Picture"/>
             <ns2:graphic>
               <ns2:graphicData uri="http://schemas.openxmlformats.org/drawingml/2006/picture">
                 <ns3:pic>
                   <ns3:nvPicPr>
-                    <ns3:cNvPr descr="figures/sudoku-blank-cells.png" id="49" name="Picture"/>
+                    <ns3:cNvPr descr="figures/sudoku-blank-cells.png" id="50" name="Picture"/>
                     <ns3:cNvPicPr>
                       <ns2:picLocks noChangeArrowheads="1" noChangeAspect="1"/>
                     </ns3:cNvPicPr>
                   </ns3:nvPicPr>
                   <ns3:blipFill>
-                    <ns2:blip ns4:embed="rId47"/>
+                    <ns2:blip ns4:embed="rId48"/>
                     <ns2:stretch>
                       <ns2:fillRect/>
                     </ns2:stretch>
@@ -14303,7 +15211,7 @@
       <w:pPr>
         <w:pStyle w:val="Heading2"/>
       </w:pPr>
-      <w:bookmarkStart w:id="50" w:name="_284bdf0fb9a265fb74e9d61c721d7692e3bf53a"/>
+      <w:bookmarkStart w:id="51" w:name="_284bdf0fb9a265fb74e9d61c721d7692e3bf53a"/>
       <w:r>
         <w:rPr>
           <w:rStyle w:val="SectionNumber"/>
@@ -14320,7 +15228,7 @@
         </w:rPr>
         <w:t xml:space="preserve">A large chat model as reference</w:t>
       </w:r>
-      <w:bookmarkEnd w:id="50"/>
+      <w:bookmarkEnd w:id="51"/>
     </w:p>
     <w:p>
       <w:pPr>
@@ -14337,7 +15245,7 @@
       <w:pPr>
         <w:pStyle w:val="Heading1"/>
       </w:pPr>
-      <w:bookmarkStart w:id="51" w:name="_f26718ac854a2b36d3239337e1131902c3e20ca"/>
+      <w:bookmarkStart w:id="52" w:name="_f26718ac854a2b36d3239337e1131902c3e20ca"/>
       <w:r>
         <w:rPr>
           <w:rStyle w:val="SectionNumber"/>
@@ -14354,7 +15262,7 @@
         </w:rPr>
         <w:t xml:space="preserve">The journey: experiment by experiment</w:t>
       </w:r>
-      <w:bookmarkEnd w:id="51"/>
+      <w:bookmarkEnd w:id="52"/>
     </w:p>
     <w:p>
       <w:pPr>
@@ -16792,7 +17700,112 @@
                 <w:sz w:val="20"/>
                 <w:szCs w:val="20"/>
               </w:rPr>
-              <w:t xml:space="preserve">New local best at twice E15 exposure; still below upstream</w:t>
+              <w:t xml:space="preserve">Best observed seed at twice E15 exposure; still below Original NCM</w:t>
+            </w:r>
+          </w:p>
+        </w:tc>
+      </w:tr>
+      <w:tr>
+        <w:trPr>
+          <w:cantSplit/>
+        </w:trPr>
+        <w:tc>
+          <w:tcPr>
+            <w:tcW w:w="936" w:type="dxa"/>
+            <w:vAlign w:val="top"/>
+          </w:tcPr>
+          <w:p>
+            <w:pPr>
+              <w:pStyle w:val="Compact"/>
+              <w:spacing w:before="0" w:after="30" w:line="240" w:lineRule="auto"/>
+            </w:pPr>
+            <w:r>
+              <w:rPr>
+                <w:lang w:val="en-GB"/>
+                <w:sz w:val="20"/>
+                <w:szCs w:val="20"/>
+              </w:rPr>
+              <w:t xml:space="preserve">E20</w:t>
+            </w:r>
+          </w:p>
+        </w:tc>
+        <w:tc>
+          <w:tcPr>
+            <w:tcW w:w="2059" w:type="dxa"/>
+            <w:vAlign w:val="top"/>
+          </w:tcPr>
+          <w:p>
+            <w:pPr>
+              <w:pStyle w:val="Compact"/>
+              <w:spacing w:before="0" w:after="30" w:line="240" w:lineRule="auto"/>
+            </w:pPr>
+            <w:r>
+              <w:rPr>
+                <w:lang w:val="en-GB"/>
+                <w:sz w:val="20"/>
+                <w:szCs w:val="20"/>
+              </w:rPr>
+              <w:t xml:space="preserve">Does the funded recipe repeat?</w:t>
+            </w:r>
+          </w:p>
+        </w:tc>
+        <w:tc>
+          <w:tcPr>
+            <w:tcW w:w="2246" w:type="dxa"/>
+            <w:vAlign w:val="top"/>
+          </w:tcPr>
+          <w:p>
+            <w:pPr>
+              <w:pStyle w:val="Compact"/>
+              <w:spacing w:before="0" w:after="30" w:line="240" w:lineRule="auto"/>
+            </w:pPr>
+            <w:r>
+              <w:rPr>
+                <w:lang w:val="en-GB"/>
+                <w:sz w:val="20"/>
+                <w:szCs w:val="20"/>
+              </w:rPr>
+              <w:t xml:space="preserve">Fresh seed 1, same scientific settings and exposure</w:t>
+            </w:r>
+          </w:p>
+        </w:tc>
+        <w:tc>
+          <w:tcPr>
+            <w:tcW w:w="1778" w:type="dxa"/>
+            <w:vAlign w:val="top"/>
+          </w:tcPr>
+          <w:p>
+            <w:pPr>
+              <w:pStyle w:val="Compact"/>
+              <w:spacing w:before="0" w:after="30" w:line="240" w:lineRule="auto"/>
+            </w:pPr>
+            <w:r>
+              <w:rPr>
+                <w:lang w:val="en-GB"/>
+                <w:sz w:val="20"/>
+                <w:szCs w:val="20"/>
+              </w:rPr>
+              <w:t xml:space="preserve">97.25% / 79.60% / 33.25%</w:t>
+            </w:r>
+          </w:p>
+        </w:tc>
+        <w:tc>
+          <w:tcPr>
+            <w:tcW w:w="2341" w:type="dxa"/>
+            <w:vAlign w:val="top"/>
+          </w:tcPr>
+          <w:p>
+            <w:pPr>
+              <w:pStyle w:val="Compact"/>
+              <w:spacing w:before="0" w:after="30" w:line="240" w:lineRule="auto"/>
+            </w:pPr>
+            <w:r>
+              <w:rPr>
+                <w:lang w:val="en-GB"/>
+                <w:sz w:val="20"/>
+                <w:szCs w:val="20"/>
+              </w:rPr>
+              <w:t xml:space="preserve">Easy/medium gains persist; hard result varies by 7.05 points; audit limits remain</w:t>
             </w:r>
           </w:p>
         </w:tc>
@@ -16853,7 +17866,7 @@
       <w:pPr>
         <w:pStyle w:val="Heading1"/>
       </w:pPr>
-      <w:bookmarkStart w:id="52" w:name="_discussion"/>
+      <w:bookmarkStart w:id="53" w:name="_discussion"/>
       <w:r>
         <w:rPr>
           <w:rStyle w:val="SectionNumber"/>
@@ -16869,104 +17882,6 @@
           <w:lang w:val="en-GB"/>
         </w:rPr>
         <w:t xml:space="preserve">Discussion</w:t>
-      </w:r>
-      <w:bookmarkEnd w:id="52"/>
-    </w:p>
-    <w:p>
-      <w:pPr>
-        <w:pStyle w:val="FirstParagraph"/>
-      </w:pPr>
-      <w:r>
-        <w:rPr>
-          <w:b/>
-          <w:bCs/>
-          <w:lang w:val="en-GB"/>
-        </w:rPr>
-        <w:t xml:space="preserve">What carries over to a laptop.</w:t>
-      </w:r>
-      <w:r>
-        <w:rPr>
-          <w:lang w:val="en-GB"/>
-        </w:rPr>
-        <w:t xml:space="preserve"> </w:t>
-      </w:r>
-      <w:r>
-        <w:rPr>
-          <w:lang w:val="en-GB"/>
-        </w:rPr>
-        <w:t xml:space="preserve">The measured Apple Silicon runs show lower NCM latency at batch 1–16 than an AR model with similar generator size. The advantage shrinks with batch size and the number of codes; the historical 12-level Sudoku run, with 314 codes plus an 81-token prefix, is slower than AR from batch 64 on. These shared-device observations do not isolate dispatch, memory traffic or kernel costs.</w:t>
-      </w:r>
-    </w:p>
-    <w:p>
-      <w:pPr>
-        <w:pStyle w:val="BodyText"/>
-      </w:pPr>
-      <w:r>
-        <w:rPr>
-          <w:b/>
-          <w:bCs/>
-          <w:lang w:val="en-GB"/>
-        </w:rPr>
-        <w:t xml:space="preserve">What does not carry over without the full recipe.</w:t>
-      </w:r>
-      <w:r>
-        <w:rPr>
-          <w:lang w:val="en-GB"/>
-        </w:rPr>
-        <w:t xml:space="preserve"> </w:t>
-      </w:r>
-      <w:r>
-        <w:rPr>
-          <w:lang w:val="en-GB"/>
-        </w:rPr>
-        <w:t xml:space="preserve">The codec-side components we added (E5, E6) improved every secondary metric a little and none moved solved boards; conditioning corruption (E8) did. The paper’s result rests on a combination of recipe and scale that small, short runs do not reach. A codec whose coarse levels look informative is necessary but far from sufficient.</w:t>
-      </w:r>
-    </w:p>
-    <w:p>
-      <w:pPr>
-        <w:pStyle w:val="BodyText"/>
-      </w:pPr>
-      <w:r>
-        <w:rPr>
-          <w:b/>
-          <w:bCs/>
-          <w:lang w:val="en-GB"/>
-        </w:rPr>
-        <w:t xml:space="preserve">Negative results worth reporting.</w:t>
-      </w:r>
-      <w:r>
-        <w:rPr>
-          <w:lang w:val="en-GB"/>
-        </w:rPr>
-        <w:t xml:space="preserve"> </w:t>
-      </w:r>
-      <w:r>
-        <w:rPr>
-          <w:lang w:val="en-GB"/>
-        </w:rPr>
-        <w:t xml:space="preserve">Two first choices made the method fail in ways reconstruction metrics hide: a level schedule that concentrates information in one level, and an area-pooled first level that encodes nothing. Both pass a codec test with 100% reconstruction.</w:t>
-      </w:r>
-    </w:p>
-    <w:p>
-      <w:pPr>
-        <w:pStyle w:val="Heading1"/>
-      </w:pPr>
-      <w:bookmarkStart w:id="53" w:name="_limitations"/>
-      <w:r>
-        <w:rPr>
-          <w:rStyle w:val="SectionNumber"/>
-          <w:lang w:val="en-GB"/>
-        </w:rPr>
-        <w:t xml:space="preserve">10</w:t>
-      </w:r>
-      <w:r>
-        <w:tab/>
-      </w:r>
-      <w:r>
-        <w:rPr>
-          <w:lang w:val="en-GB"/>
-        </w:rPr>
-        <w:t xml:space="preserve">Limitations</w:t>
       </w:r>
       <w:bookmarkEnd w:id="53"/>
     </w:p>
@@ -16976,21 +17891,169 @@
       </w:pPr>
       <w:r>
         <w:rPr>
-          <w:lang w:val="en-GB"/>
-        </w:rPr>
-        <w:t xml:space="preserve">Most generator runs use at most 6.4M parameters; width-512 ablations use 25M. Training budgets range from minutes to about 15 hours of generator training per run. The strongest result uses one training seed and remains 45.8 percentage points below the original on hard boards; uncertainty across seeds is unknown. The only language-like task is synthetic; the paper’s text benchmarks (LM1B, OpenWebText, XSum, WMT14) were not run. Latency measurements share the GPU with other workloads unless stated. The upstream training code is not public, so recipe details not stated in the paper are guesses.</w:t>
+          <w:b/>
+          <w:bCs/>
+          <w:lang w:val="en-GB"/>
+        </w:rPr>
+        <w:t xml:space="preserve">What carries over to a laptop.</w:t>
+      </w:r>
+      <w:r>
+        <w:rPr>
+          <w:lang w:val="en-GB"/>
+        </w:rPr>
+        <w:t xml:space="preserve"> </w:t>
+      </w:r>
+      <w:r>
+        <w:rPr>
+          <w:lang w:val="en-GB"/>
+        </w:rPr>
+        <w:t xml:space="preserve">Measured Apple Silicon runs show lower small-batch NCM latency than an AR model of similar generator size on the tested synthetic task. The advantage shrinks with batch size and code count; historical 12-level Sudoku generation is slower than AR from batch 64 on. These observations do not establish natural-text speed or isolate dispatch, memory traffic and kernel costs. The completed E19/E20 training runs use CUDA, not the Mac.</w:t>
+      </w:r>
+    </w:p>
+    <w:p>
+      <w:pPr>
+        <w:pStyle w:val="BodyText"/>
+      </w:pPr>
+      <w:r>
+        <w:rPr>
+          <w:b/>
+          <w:bCs/>
+          <w:lang w:val="en-GB"/>
+        </w:rPr>
+        <w:t xml:space="preserve">Partial success at the tested scale.</w:t>
+      </w:r>
+      <w:r>
+        <w:rPr>
+          <w:lang w:val="en-GB"/>
+        </w:rPr>
+        <w:t xml:space="preserve"> </w:t>
+      </w:r>
+      <w:r>
+        <w:rPr>
+          <w:lang w:val="en-GB"/>
+        </w:rPr>
+        <w:t xml:space="preserve">A 6.44M generator learns substantial puzzle-conditioned structure: both funded-recipe seeds solve more than 97% of easy boards and 79% of medium boards. Both exceed E15’s reported rates, with twice its generator exposure and a changed overall recipe. This is sufficient evidence to continue studying the implementation. It is not an estimate of minimum required capacity, a scaling law or a demonstration of human-style logical reasoning. The additional codec prevents treating generator size as whole-system size.</w:t>
+      </w:r>
+    </w:p>
+    <w:p>
+      <w:pPr>
+        <w:pStyle w:val="BodyText"/>
+      </w:pPr>
+      <w:r>
+        <w:rPr>
+          <w:b/>
+          <w:bCs/>
+          <w:lang w:val="en-GB"/>
+        </w:rPr>
+        <w:t xml:space="preserve">Why hard Sudoku remains unresolved.</w:t>
+      </w:r>
+      <w:r>
+        <w:rPr>
+          <w:lang w:val="en-GB"/>
+        </w:rPr>
+        <w:t xml:space="preserve"> </w:t>
+      </w:r>
+      <w:r>
+        <w:rPr>
+          <w:lang w:val="en-GB"/>
+        </w:rPr>
+        <w:t xml:space="preserve">The hard benchmark provides 30 clues, leaving 51 blanks, versus 40 clues and 41 blanks on easy boards. Every constraint and input clue must be satisfied simultaneously. Errors can be correlated, and a small change in average cell accuracy can accompany a larger change in exact-board accuracy. Neither clue count nor these aggregates reveals which logical dependencies the model fails to represent. The reference comparison also changes capacity, exposure, representation, corpus and difficulty-specific training. Those are candidate explanations, not experimentally established causes. Earlier width-512 trials do not justify promising that widening alone closes the gap.</w:t>
+      </w:r>
+    </w:p>
+    <w:p>
+      <w:pPr>
+        <w:pStyle w:val="BodyText"/>
+      </w:pPr>
+      <w:r>
+        <w:rPr>
+          <w:b/>
+          <w:bCs/>
+          <w:lang w:val="en-GB"/>
+        </w:rPr>
+        <w:t xml:space="preserve">How to challenge the interpretation.</w:t>
+      </w:r>
+      <w:r>
+        <w:rPr>
+          <w:lang w:val="en-GB"/>
+        </w:rPr>
+        <w:t xml:space="preserve"> </w:t>
+      </w:r>
+      <w:r>
+        <w:rPr>
+          <w:lang w:val="en-GB"/>
+        </w:rPr>
+        <w:t xml:space="preserve">Before further long runs, retain checkpoint-bound input identities, per-board outputs and per-level diagnostics. Use a fresh untouched test set after fixing the selection protocol, since repeated examination of these benchmarks can guide recipe choices. Additional seeds characterize variation; separate random streams and controlled interventions are needed to identify whether initialization, order, dropout or corruption matters. True-code interventions on a diagnostic subset can test error propagation. Matched-data capacity and exposure ablations can test scale without conflating both. Checkpoint selection must use validation data rather than the external benchmark. These are proposed tests, not completed findings.</w:t>
+      </w:r>
+    </w:p>
+    <w:p>
+      <w:pPr>
+        <w:pStyle w:val="BodyText"/>
+      </w:pPr>
+      <w:r>
+        <w:rPr>
+          <w:b/>
+          <w:bCs/>
+          <w:lang w:val="en-GB"/>
+        </w:rPr>
+        <w:t xml:space="preserve">Decision for the next phase.</w:t>
+      </w:r>
+      <w:r>
+        <w:rPr>
+          <w:lang w:val="en-GB"/>
+        </w:rPr>
+        <w:t xml:space="preserve"> </w:t>
+      </w:r>
+      <w:r>
+        <w:rPr>
+          <w:lang w:val="en-GB"/>
+        </w:rPr>
+        <w:t xml:space="preserve">The project can proceed to controlled text research without declaring the Sudoku reproduction complete. Keep the small generator as a reference while investigating independently converted Original NCM weights. Conversion parity would validate inference compatibility; it would not reproduce training or validate our smaller model. Begin text with a pinned permitted corpus, explicit tokenizer and padding boundaries, and document-separated splits. Report reconstruction and free-running generation separately, include readable failures and an autoregressive comparison with total-cost qualifications. Synthetic TinyStories would be an initial engineering benchmark; naturally occurring text and conditional tasks require further evidence. No instruction-following, summarization, translation or useful application integration follows from Sudoku scores.</w:t>
       </w:r>
     </w:p>
     <w:p>
       <w:pPr>
         <w:pStyle w:val="Heading1"/>
       </w:pPr>
-      <w:bookmarkStart w:id="54" w:name="_c402fc6a47ec8bb5e751ab4b29e0fc7601a51bb"/>
+      <w:bookmarkStart w:id="54" w:name="_limitations"/>
       <w:r>
         <w:rPr>
           <w:rStyle w:val="SectionNumber"/>
           <w:lang w:val="en-GB"/>
         </w:rPr>
+        <w:t xml:space="preserve">10</w:t>
+      </w:r>
+      <w:r>
+        <w:tab/>
+      </w:r>
+      <w:r>
+        <w:rPr>
+          <w:lang w:val="en-GB"/>
+        </w:rPr>
+        <w:t xml:space="preserve">Limitations</w:t>
+      </w:r>
+      <w:bookmarkEnd w:id="54"/>
+    </w:p>
+    <w:p>
+      <w:pPr>
+        <w:pStyle w:val="FirstParagraph"/>
+      </w:pPr>
+      <w:r>
+        <w:rPr>
+          <w:lang w:val="en-GB"/>
+        </w:rPr>
+        <w:t xml:space="preserve">Most generator recipes use at most 6.4M parameters; width-512 ablations use about 25M. E19-funded and E20 provide only two training seeds of one recipe, not a reliable population variance estimate. The best hard score remains 45.80 points below Original NCM; the second seed remains 52.85 points below. No current-budget AR comparison, matched total-cost study or natural-text validation is available. Full-depth codec validation reconstruction does not prove useful coarse representations under generated errors. Historical aggregate-only scoring, missing remote manifests, repeated benchmark-guided development and unknown benchmark contention limit independent audit and generalization. The original training implementation is not released; unstated recipe details remain uncertain. Existing measurements establish neither production reliability nor a benefit in a user application.</w:t>
+      </w:r>
+    </w:p>
+    <w:p>
+      <w:pPr>
+        <w:pStyle w:val="Heading1"/>
+      </w:pPr>
+      <w:bookmarkStart w:id="55" w:name="_c402fc6a47ec8bb5e751ab4b29e0fc7601a51bb"/>
+      <w:r>
+        <w:rPr>
+          <w:rStyle w:val="SectionNumber"/>
+          <w:lang w:val="en-GB"/>
+        </w:rPr>
         <w:t xml:space="preserve">11</w:t>
       </w:r>
       <w:r>
@@ -17002,7 +18065,7 @@
         </w:rPr>
         <w:t xml:space="preserve">Related work</w:t>
       </w:r>
-      <w:bookmarkEnd w:id="54"/>
+      <w:bookmarkEnd w:id="55"/>
     </w:p>
     <w:p>
       <w:pPr>
@@ -17224,7 +18287,7 @@
         </w:rPr>
         <w:t xml:space="preserve"> </w:t>
       </w:r>
-      <w:hyperlink ns4:id="rId55">
+      <w:hyperlink ns4:id="rId56">
         <w:r>
           <w:rPr>
             <w:rStyle w:val="Hyperlink"/>
@@ -17250,7 +18313,7 @@
       <w:pPr>
         <w:pStyle w:val="Heading1"/>
       </w:pPr>
-      <w:bookmarkStart w:id="56" w:name="_conclusion"/>
+      <w:bookmarkStart w:id="57" w:name="_conclusion"/>
       <w:r>
         <w:rPr>
           <w:rStyle w:val="SectionNumber"/>
@@ -17266,30 +18329,6 @@
           <w:lang w:val="en-GB"/>
         </w:rPr>
         <w:t xml:space="preserve">Conclusion</w:t>
-      </w:r>
-      <w:bookmarkEnd w:id="56"/>
-    </w:p>
-    <w:p>
-      <w:pPr>
-        <w:pStyle w:val="FirstParagraph"/>
-      </w:pPr>
-      <w:r>
-        <w:rPr>
-          <w:lang w:val="en-GB"/>
-        </w:rPr>
-        <w:t xml:space="preserve">NCM can be implemented natively in MLX with a training/generation equivalence invariant checked exactly on CPU. These experiments show low small-batch latency and a remaining accuracy gap to upstream Sudoku results. Conditioning corruption addresses the mismatch between true training codes and sampled inference codes; it produced the first solved boards, while increased data exposure improved the result further. Model-sampled corruption did not improve the tested configuration (E9). Larger budgets, repeated training seeds and real-text evaluation remain research work.</w:t>
-      </w:r>
-    </w:p>
-    <w:p>
-      <w:pPr>
-        <w:pStyle w:val="Heading1"/>
-      </w:pPr>
-      <w:bookmarkStart w:id="57" w:name="_ea7704638cb275cc13e6a845de5f21656bc540d"/>
-      <w:r>
-        <w:rPr>
-          <w:lang w:val="en-GB"/>
-        </w:rPr>
-        <w:t xml:space="preserve">Code and reproducibility</w:t>
       </w:r>
       <w:bookmarkEnd w:id="57"/>
     </w:p>
@@ -17301,6 +18340,30 @@
         <w:rPr>
           <w:lang w:val="en-GB"/>
         </w:rPr>
+        <w:t xml:space="preserve">This independent MLX implementation preserves exact CPU training/per-level inference equivalence and demonstrates coarse-to-fine generation on a finite synthetic language and Sudoku. The funded small-generator recipe reports 97.25–98.10% easy, 79.60–83.40% medium and 33.25–40.30% hard solving across two seeds at equal exposure. We regard this as partial implementation and small-model success, with substantial failures on hard boards and unresolved provenance and reproducibility limits. It does not reproduce Original NCM’s scores or establish matched-cost superiority. The observed seed difference warrants better diagnostics rather than attributing the deficit to a single component. The next research phase will test text generation and its quality/cost tradeoff; those capabilities remain unvalidated.</w:t>
+      </w:r>
+    </w:p>
+    <w:p>
+      <w:pPr>
+        <w:pStyle w:val="Heading1"/>
+      </w:pPr>
+      <w:bookmarkStart w:id="58" w:name="_ea7704638cb275cc13e6a845de5f21656bc540d"/>
+      <w:r>
+        <w:rPr>
+          <w:lang w:val="en-GB"/>
+        </w:rPr>
+        <w:t xml:space="preserve">Code and reproducibility</w:t>
+      </w:r>
+      <w:bookmarkEnd w:id="58"/>
+    </w:p>
+    <w:p>
+      <w:pPr>
+        <w:pStyle w:val="FirstParagraph"/>
+      </w:pPr>
+      <w:r>
+        <w:rPr>
+          <w:lang w:val="en-GB"/>
+        </w:rPr>
         <w:t xml:space="preserve">Code, configurations and this paper:</w:t>
       </w:r>
       <w:r>
@@ -17309,7 +18372,7 @@
         </w:rPr>
         <w:t xml:space="preserve"> </w:t>
       </w:r>
-      <w:hyperlink ns4:id="rId58">
+      <w:hyperlink ns4:id="rId59">
         <w:r>
           <w:rPr>
             <w:rStyle w:val="Hyperlink"/>
@@ -17504,14 +18567,14 @@
       <w:pPr>
         <w:pStyle w:val="Heading1"/>
       </w:pPr>
-      <w:bookmarkStart w:id="59" w:name="_a1ac0186124a25a02d676ec397b07176e03c318"/>
+      <w:bookmarkStart w:id="60" w:name="_a1ac0186124a25a02d676ec397b07176e03c318"/>
       <w:r>
         <w:rPr>
           <w:lang w:val="en-GB"/>
         </w:rPr>
         <w:t xml:space="preserve">AI assistance</w:t>
       </w:r>
-      <w:bookmarkEnd w:id="59"/>
+      <w:bookmarkEnd w:id="60"/>
     </w:p>
     <w:p>
       <w:pPr>
@@ -17521,24 +18584,24 @@
         <w:rPr>
           <w:lang w:val="en-GB"/>
         </w:rPr>
-        <w:t xml:space="preserve">OpenAI Codex assisted with code, documentation and manuscript drafting and revision. It is not an author. This assistance does not constitute independent verification of the results or human review of the manuscript.</w:t>
+        <w:t xml:space="preserve">OpenAI Codex assisted with implementation, experiments, analysis, figures, documentation and manuscript drafting and revision. It is not an author. This assistance does not constitute independent verification of the results or human review of the manuscript.</w:t>
       </w:r>
     </w:p>
     <w:p>
       <w:pPr>
         <w:pStyle w:val="Heading1"/>
       </w:pPr>
-      <w:bookmarkStart w:id="60" w:name="_references"/>
+      <w:bookmarkStart w:id="61" w:name="_references"/>
       <w:r>
         <w:rPr>
           <w:lang w:val="en-GB"/>
         </w:rPr>
         <w:t xml:space="preserve">References</w:t>
       </w:r>
-      <w:bookmarkEnd w:id="60"/>
+      <w:bookmarkEnd w:id="61"/>
     </w:p>
-    <w:bookmarkStart w:id="72" w:name="_refs"/>
-    <w:bookmarkStart w:id="61" w:name="_7178c6d97c83436ac51e3d67a795fe1f0539a1f"/>
+    <w:bookmarkStart w:id="73" w:name="_refs"/>
+    <w:bookmarkStart w:id="62" w:name="_7178c6d97c83436ac51e3d67a795fe1f0539a1f"/>
     <w:p>
       <w:pPr>
         <w:pStyle w:val="Bibliography"/>
@@ -17589,8 +18652,8 @@
         <w:t xml:space="preserve">.</w:t>
       </w:r>
     </w:p>
-    <w:bookmarkEnd w:id="61"/>
-    <w:bookmarkStart w:id="63" w:name="_22c2001aa78ad7aea289a48a7ef9956283b8785"/>
+    <w:bookmarkEnd w:id="62"/>
+    <w:bookmarkStart w:id="64" w:name="_22c2001aa78ad7aea289a48a7ef9956283b8785"/>
     <w:p>
       <w:pPr>
         <w:pStyle w:val="Bibliography"/>
@@ -17636,7 +18699,7 @@
         </w:rPr>
         <w:t xml:space="preserve"> </w:t>
       </w:r>
-      <w:hyperlink ns4:id="rId62">
+      <w:hyperlink ns4:id="rId63">
         <w:r>
           <w:rPr>
             <w:rStyle w:val="Hyperlink"/>
@@ -17652,8 +18715,8 @@
         <w:t xml:space="preserve">.</w:t>
       </w:r>
     </w:p>
-    <w:bookmarkEnd w:id="63"/>
-    <w:bookmarkStart w:id="64" w:name="_467f4199928b1ab5831cfd23859fbdb18c1801c"/>
+    <w:bookmarkEnd w:id="64"/>
+    <w:bookmarkStart w:id="65" w:name="_467f4199928b1ab5831cfd23859fbdb18c1801c"/>
     <w:p>
       <w:pPr>
         <w:pStyle w:val="Bibliography"/>
@@ -17704,8 +18767,8 @@
         <w:t xml:space="preserve">.</w:t>
       </w:r>
     </w:p>
-    <w:bookmarkEnd w:id="64"/>
-    <w:bookmarkStart w:id="65" w:name="_652dea1f203f9076ff3a92d6c71b61d234bd0a1"/>
+    <w:bookmarkEnd w:id="65"/>
+    <w:bookmarkStart w:id="66" w:name="_652dea1f203f9076ff3a92d6c71b61d234bd0a1"/>
     <w:p>
       <w:pPr>
         <w:pStyle w:val="Bibliography"/>
@@ -17756,8 +18819,8 @@
         <w:t xml:space="preserve">.</w:t>
       </w:r>
     </w:p>
-    <w:bookmarkEnd w:id="65"/>
-    <w:bookmarkStart w:id="66" w:name="_16a5c5d099436b6e8ddbcaaceeaae077a39ab23"/>
+    <w:bookmarkEnd w:id="66"/>
+    <w:bookmarkStart w:id="67" w:name="_16a5c5d099436b6e8ddbcaaceeaae077a39ab23"/>
     <w:p>
       <w:pPr>
         <w:pStyle w:val="Bibliography"/>
@@ -17808,8 +18871,8 @@
         <w:t xml:space="preserve">.</w:t>
       </w:r>
     </w:p>
-    <w:bookmarkEnd w:id="66"/>
-    <w:bookmarkStart w:id="67" w:name="_193777c8a7049c9edc002af66cbb9f7ca9ecd0d"/>
+    <w:bookmarkEnd w:id="67"/>
+    <w:bookmarkStart w:id="68" w:name="_193777c8a7049c9edc002af66cbb9f7ca9ecd0d"/>
     <w:p>
       <w:pPr>
         <w:pStyle w:val="Bibliography"/>
@@ -17860,8 +18923,8 @@
         <w:t xml:space="preserve">.</w:t>
       </w:r>
     </w:p>
-    <w:bookmarkEnd w:id="67"/>
-    <w:bookmarkStart w:id="68" w:name="_9ce0df2006fb1fb2e7d2fff813ee7d4c789115b"/>
+    <w:bookmarkEnd w:id="68"/>
+    <w:bookmarkStart w:id="69" w:name="_9ce0df2006fb1fb2e7d2fff813ee7d4c789115b"/>
     <w:p>
       <w:pPr>
         <w:pStyle w:val="Bibliography"/>
@@ -17912,8 +18975,8 @@
         <w:t xml:space="preserve">.</w:t>
       </w:r>
     </w:p>
-    <w:bookmarkEnd w:id="68"/>
-    <w:bookmarkStart w:id="69" w:name="_6617e1df4c3b4092182fef8ff1d6c88b6e54307"/>
+    <w:bookmarkEnd w:id="69"/>
+    <w:bookmarkStart w:id="70" w:name="_6617e1df4c3b4092182fef8ff1d6c88b6e54307"/>
     <w:p>
       <w:pPr>
         <w:pStyle w:val="Bibliography"/>
@@ -17976,8 +19039,8 @@
         <w:t xml:space="preserve">.</w:t>
       </w:r>
     </w:p>
-    <w:bookmarkEnd w:id="69"/>
-    <w:bookmarkStart w:id="70" w:name="_99c1d1258865f103d21eca3beae1bb24266bd09"/>
+    <w:bookmarkEnd w:id="70"/>
+    <w:bookmarkStart w:id="71" w:name="_99c1d1258865f103d21eca3beae1bb24266bd09"/>
     <w:p>
       <w:pPr>
         <w:pStyle w:val="Bibliography"/>
@@ -18028,8 +19091,8 @@
         <w:t xml:space="preserve">.</w:t>
       </w:r>
     </w:p>
-    <w:bookmarkEnd w:id="70"/>
-    <w:bookmarkStart w:id="71" w:name="_6af57b8dbe9741da011302feeade8167f05cd0b"/>
+    <w:bookmarkEnd w:id="71"/>
+    <w:bookmarkStart w:id="72" w:name="_6af57b8dbe9741da011302feeade8167f05cd0b"/>
     <w:p>
       <w:pPr>
         <w:pStyle w:val="Bibliography"/>
@@ -18080,20 +19143,20 @@
         <w:t xml:space="preserve">.</w:t>
       </w:r>
     </w:p>
-    <w:bookmarkEnd w:id="71"/>
     <w:bookmarkEnd w:id="72"/>
+    <w:bookmarkEnd w:id="73"/>
     <w:p>
       <w:pPr>
         <w:pStyle w:val="Heading1"/>
       </w:pPr>
-      <w:bookmarkStart w:id="73" w:name="_8d22d2f750ed15b9f9dd99947a4572953bd9af3"/>
+      <w:bookmarkStart w:id="74" w:name="_8d22d2f750ed15b9f9dd99947a4572953bd9af3"/>
       <w:r>
         <w:rPr>
           <w:lang w:val="en-GB"/>
         </w:rPr>
         <w:t xml:space="preserve">Appendix A: Hyperparameters</w:t>
       </w:r>
-      <w:bookmarkEnd w:id="73"/>
+      <w:bookmarkEnd w:id="74"/>
     </w:p>
     <w:p>
       <w:pPr>
@@ -19354,7 +20417,7 @@
         <w:rPr>
           <w:lang w:val="en-GB"/>
         </w:rPr>
-        <w:t xml:space="preserve">Later Sudoku runs reuse the frozen E6 codec and its 12-level, 16-code hierarchy. All use an 81-cell prefix, eight attention heads, generator seed 0, AdamW with weight decay 0.01, a cosine learning-rate schedule and compiled generator training. Generator dropout is 0.1 at width 256 and 0.2 at width 512; warmup is 200 steps at width 256 except E19, which uses 1,000; width 512 also uses 1,000. The codec is additional to the generator sizes below.</w:t>
+        <w:t xml:space="preserve">Later Sudoku runs reuse the frozen E6 codec and its 12-level, 16-code hierarchy. All use an 81-cell prefix, eight attention heads, configured generator seed 0 except E20 (seed 1), AdamW with weight decay 0.01, a cosine learning-rate schedule and compiled generator training. Generator dropout is 0.1 at width 256 and 0.2 at width 512; warmup is 200 steps at width 256 except E19/E20, which use 1,000; width 512 also uses 1,000. The codec is additional to the generator sizes below.</w:t>
       </w:r>
     </w:p>
     <w:p>
@@ -20922,6 +21985,131 @@
           </w:p>
         </w:tc>
       </w:tr>
+      <w:tr>
+        <w:trPr>
+          <w:cantSplit/>
+        </w:trPr>
+        <w:tc>
+          <w:tcPr>
+            <w:tcW w:w="1685" w:type="dxa"/>
+            <w:vAlign w:val="top"/>
+          </w:tcPr>
+          <w:p>
+            <w:pPr>
+              <w:pStyle w:val="Compact"/>
+              <w:spacing w:before="0" w:after="30" w:line="240" w:lineRule="auto"/>
+            </w:pPr>
+            <w:r>
+              <w:rPr>
+                <w:lang w:val="en-GB"/>
+                <w:sz w:val="21"/>
+                <w:szCs w:val="21"/>
+              </w:rPr>
+              <w:t xml:space="preserve">E20</w:t>
+            </w:r>
+          </w:p>
+        </w:tc>
+        <w:tc>
+          <w:tcPr>
+            <w:tcW w:w="1498" w:type="dxa"/>
+            <w:vAlign w:val="top"/>
+          </w:tcPr>
+          <w:p>
+            <w:pPr>
+              <w:pStyle w:val="Compact"/>
+              <w:spacing w:before="0" w:after="30" w:line="240" w:lineRule="auto"/>
+            </w:pPr>
+            <w:r>
+              <w:rPr>
+                <w:lang w:val="en-GB"/>
+                <w:sz w:val="21"/>
+                <w:szCs w:val="21"/>
+              </w:rPr>
+              <w:t xml:space="preserve">8 × 256</w:t>
+            </w:r>
+          </w:p>
+        </w:tc>
+        <w:tc>
+          <w:tcPr>
+            <w:tcW w:w="1498" w:type="dxa"/>
+            <w:vAlign w:val="top"/>
+          </w:tcPr>
+          <w:p>
+            <w:pPr>
+              <w:pStyle w:val="Compact"/>
+              <w:spacing w:before="0" w:after="30" w:line="240" w:lineRule="auto"/>
+            </w:pPr>
+            <w:r>
+              <w:rPr>
+                <w:lang w:val="en-GB"/>
+                <w:sz w:val="21"/>
+                <w:szCs w:val="21"/>
+              </w:rPr>
+              <w:t xml:space="preserve">128,000</w:t>
+            </w:r>
+          </w:p>
+        </w:tc>
+        <w:tc>
+          <w:tcPr>
+            <w:tcW w:w="1030" w:type="dxa"/>
+            <w:vAlign w:val="top"/>
+          </w:tcPr>
+          <w:p>
+            <w:pPr>
+              <w:pStyle w:val="Compact"/>
+              <w:spacing w:before="0" w:after="30" w:line="240" w:lineRule="auto"/>
+            </w:pPr>
+            <w:r>
+              <w:rPr>
+                <w:lang w:val="en-GB"/>
+                <w:sz w:val="21"/>
+                <w:szCs w:val="21"/>
+              </w:rPr>
+              <w:t xml:space="preserve">128</w:t>
+            </w:r>
+          </w:p>
+        </w:tc>
+        <w:tc>
+          <w:tcPr>
+            <w:tcW w:w="1591" w:type="dxa"/>
+            <w:vAlign w:val="top"/>
+          </w:tcPr>
+          <w:p>
+            <w:pPr>
+              <w:pStyle w:val="Compact"/>
+              <w:spacing w:before="0" w:after="30" w:line="240" w:lineRule="auto"/>
+            </w:pPr>
+            <w:r>
+              <w:rPr>
+                <w:lang w:val="en-GB"/>
+                <w:sz w:val="21"/>
+                <w:szCs w:val="21"/>
+              </w:rPr>
+              <w:t xml:space="preserve">6e-4</w:t>
+            </w:r>
+          </w:p>
+        </w:tc>
+        <w:tc>
+          <w:tcPr>
+            <w:tcW w:w="2058" w:type="dxa"/>
+            <w:vAlign w:val="top"/>
+          </w:tcPr>
+          <w:p>
+            <w:pPr>
+              <w:pStyle w:val="Compact"/>
+              <w:spacing w:before="0" w:after="30" w:line="240" w:lineRule="auto"/>
+            </w:pPr>
+            <w:r>
+              <w:rPr>
+                <w:lang w:val="en-GB"/>
+                <w:sz w:val="21"/>
+                <w:szCs w:val="21"/>
+              </w:rPr>
+              <w:t xml:space="preserve">0.50 → 0.10</w:t>
+            </w:r>
+          </w:p>
+        </w:tc>
+      </w:tr>
     </w:tbl>
     <w:p>
       <w:pPr>
@@ -20931,7 +22119,7 @@
         <w:rPr>
           <w:lang w:val="en-GB"/>
         </w:rPr>
-        <w:t xml:space="preserve">The base data are 200,000 training puzzles and 1,000 validation puzzles, with split seed 0 and 28–45 givens. E15 adds one million greedy-unique puzzles for each seed 201–204; E16 adds one million for each seed 205–206. E17 adds the unique subset of one million random-removal candidates for each seed 101–104; its final 2,000 steps are a weights-only continuation with reset optimizer and random state (Section 6.5). E12’s recorded run completed 50,776 steps; the repository’s current E12 configuration specifies 200,000, so running that configuration unchanged does not reproduce the reported exposure. E18 adds no unique-puzzle corpus. Both E19 runs add one million greedy-unique puzzles per seed 201–208; their separate schedules use full-state snapshots every 1,000 updates. The original million-step E19 configuration remains unstarted and is not either reported result. Full settings and checkpoint prerequisites are in the corresponding</w:t>
+        <w:t xml:space="preserve">The base data are 200,000 training puzzles and 1,000 validation puzzles, with split seed 0 and 28–45 givens. E15 adds one million greedy-unique puzzles for each seed 201–204; E16 adds one million for each seed 205–206. E17 adds the unique subset of one million random-removal candidates for each seed 101–104; its final 2,000 steps are a weights-only continuation with reset optimizer and random state (Section 6.5). E12’s recorded run completed 50,776 steps; the repository’s current E12 configuration specifies 200,000, so running that configuration unchanged does not reproduce the reported exposure. E18 adds no unique-puzzle corpus. Both E19 runs and E20 add one million greedy-unique puzzles per seed 201–208; their separate schedules use full-state snapshots every 1,000 updates. The original million-step E19 configuration remains unstarted and is not either reported result. Full settings and checkpoint prerequisites are in the corresponding</w:t>
       </w:r>
       <w:r>
         <w:rPr>
@@ -20982,14 +22170,14 @@
       <w:pPr>
         <w:pStyle w:val="Heading1"/>
       </w:pPr>
-      <w:bookmarkStart w:id="74" w:name="_267f4a9aaa72a933142e09d7546704f4222ae97"/>
+      <w:bookmarkStart w:id="75" w:name="_267f4a9aaa72a933142e09d7546704f4222ae97"/>
       <w:r>
         <w:rPr>
           <w:lang w:val="en-GB"/>
         </w:rPr>
         <w:t xml:space="preserve">Appendix B: Environment</w:t>
       </w:r>
-      <w:bookmarkEnd w:id="74"/>
+      <w:bookmarkEnd w:id="75"/>
     </w:p>
     <w:p>
       <w:pPr>
@@ -20999,21 +22187,21 @@
         <w:rPr>
           <w:lang w:val="en-GB"/>
         </w:rPr>
-        <w:t xml:space="preserve">Apple M5 Pro, 64 GB unified memory, macOS 26.5; MLX 0.32.3, NumPy, Python 3.12.14 managed with mise and uv. Figures: matplotlib. Paper: Pandoc and Typst. E18: RTX 3080, Python 3.12.15; both E19 runs: NVIDIA A40, Python 3.12.3, MLX 0.32.3 CUDA. Preflight and contention qualifications accompany each run in the experiment log.</w:t>
+        <w:t xml:space="preserve">Apple M5 Pro, 64 GB unified memory, macOS 26.5; MLX 0.32.3, NumPy, Python 3.12.14 managed with mise and uv. Figures: matplotlib. Paper: Pandoc and Typst. E18: RTX 3080, Python 3.12.15; both E19 runs and E20: NVIDIA A40, Python 3.12.3, MLX 0.32.3 CUDA. Preflight and contention qualifications accompany each run in the experiment log.</w:t>
       </w:r>
     </w:p>
     <w:p>
       <w:pPr>
         <w:pStyle w:val="Heading1"/>
       </w:pPr>
-      <w:bookmarkStart w:id="75" w:name="_4e54121e4b113b611ef349ccf43bc3e3e0477ac"/>
+      <w:bookmarkStart w:id="76" w:name="_4e54121e4b113b611ef349ccf43bc3e3e0477ac"/>
       <w:r>
         <w:rPr>
           <w:lang w:val="en-GB"/>
         </w:rPr>
         <w:t xml:space="preserve">Appendix C: Version history</w:t>
       </w:r>
-      <w:bookmarkEnd w:id="75"/>
+      <w:bookmarkEnd w:id="76"/>
     </w:p>
     <w:tbl>
       <w:tblPr>
@@ -21761,6 +22949,71 @@
                 <w:szCs w:val="21"/>
               </w:rPr>
               <w:t xml:space="preserve">Completed E18/E19 results, checkpoint provenance, A40 timings, uncertainty and explicit budget differences.</w:t>
+            </w:r>
+          </w:p>
+        </w:tc>
+      </w:tr>
+      <w:tr>
+        <w:trPr>
+          <w:cantSplit/>
+        </w:trPr>
+        <w:tc>
+          <w:tcPr>
+            <w:tcW w:w="1123" w:type="dxa"/>
+            <w:vAlign w:val="top"/>
+          </w:tcPr>
+          <w:p>
+            <w:pPr>
+              <w:pStyle w:val="Compact"/>
+              <w:spacing w:before="0" w:after="30" w:line="240" w:lineRule="auto"/>
+            </w:pPr>
+            <w:r>
+              <w:rPr>
+                <w:lang w:val="en-GB"/>
+                <w:sz w:val="21"/>
+                <w:szCs w:val="21"/>
+              </w:rPr>
+              <w:t xml:space="preserve">0.11</w:t>
+            </w:r>
+          </w:p>
+        </w:tc>
+        <w:tc>
+          <w:tcPr>
+            <w:tcW w:w="1685" w:type="dxa"/>
+            <w:vAlign w:val="top"/>
+          </w:tcPr>
+          <w:p>
+            <w:pPr>
+              <w:pStyle w:val="Compact"/>
+              <w:spacing w:before="0" w:after="30" w:line="240" w:lineRule="auto"/>
+            </w:pPr>
+            <w:r>
+              <w:rPr>
+                <w:lang w:val="en-GB"/>
+                <w:sz w:val="21"/>
+                <w:szCs w:val="21"/>
+              </w:rPr>
+              <w:t xml:space="preserve">2026-10-27</w:t>
+            </w:r>
+          </w:p>
+        </w:tc>
+        <w:tc>
+          <w:tcPr>
+            <w:tcW w:w="6552" w:type="dxa"/>
+            <w:vAlign w:val="top"/>
+          </w:tcPr>
+          <w:p>
+            <w:pPr>
+              <w:pStyle w:val="Compact"/>
+              <w:spacing w:before="0" w:after="30" w:line="240" w:lineRule="auto"/>
+            </w:pPr>
+            <w:r>
+              <w:rPr>
+                <w:lang w:val="en-GB"/>
+                <w:sz w:val="21"/>
+                <w:szCs w:val="21"/>
+              </w:rPr>
+              <w:t xml:space="preserve">Completed E20 seed replication; two-seed assessment, hard-board failure accounting, explicit provenance limits and a gated text-research direction.</w:t>
             </w:r>
           </w:p>
         </w:tc>

</xml_diff>